<commit_message>
Boynt: PRD 1.0 for approval (demo account, SaaS, stability, phased plan)
</commit_message>
<xml_diff>
--- a/Boynt/أبحاث/ملفات/Boynt_PRD_AR.docx
+++ b/Boynt/أبحاث/ملفات/Boynt_PRD_AR.docx
@@ -33,7 +33,7 @@
           <w:rtl/>
           <w:szCs w:val="22"/>
         </w:rPr>
-        <w:t>الإصدار ٠٫٩ · ٣٠ أكتوبر ٢٠٢٦ · الجهة المالكة: فيونكس · الحالة: مسودة للمراجعة</w:t>
+        <w:t>الإصدار ١٫٠ · ٣٠ أكتوبر ٢٠٢٦ · الجهة المالكة: فيونكس · الحالة: للاعتماد قبل البناء</w:t>
       </w:r>
     </w:p>
     <w:p>
@@ -9900,13 +9900,13 @@
         <w:rPr>
           <w:rFonts w:ascii="Arial" w:hAnsi="Arial" w:cs="Arial"/>
           <w:b/>
-          <w:color w:val="006A5B"/>
-          <w:sz w:val="30"/>
-          <w:rtl/>
-          <w:szCs w:val="30"/>
+          <w:color w:val="1663D6"/>
+          <w:sz w:val="25"/>
+          <w:rtl/>
+          <w:szCs w:val="25.0"/>
           <w:bCs/>
         </w:rPr>
-        <w:t>١٠. البيانات</w:t>
+        <w:t>٩٫١٨ الحساب التجريبي: ديمو حقيقي يجربه العميل بنفسه (P0)</w:t>
       </w:r>
     </w:p>
     <w:p>
@@ -9922,7 +9922,28 @@
           <w:rtl/>
           <w:szCs w:val="22"/>
         </w:rPr>
-        <w:t>المرجع الأساسي للبيانات يبقى نظام المحاسبة. Boynt يحتفظ بجداول تشغيلية:</w:t>
+        <w:t xml:space="preserve">الهدف: العميل يسجّل ويدخل </w:t>
+      </w:r>
+      <w:r>
+        <w:rPr>
+          <w:rFonts w:ascii="Arial" w:hAnsi="Arial" w:cs="Arial"/>
+          <w:b/>
+          <w:sz w:val="22"/>
+          <w:rtl/>
+          <w:szCs w:val="22"/>
+          <w:bCs/>
+        </w:rPr>
+        <w:t>التطبيق الحقيقي</w:t>
+      </w:r>
+      <w:r>
+        <w:rPr>
+          <w:rFonts w:ascii="Arial" w:hAnsi="Arial" w:cs="Arial"/>
+          <w:b w:val="0"/>
+          <w:sz w:val="22"/>
+          <w:rtl/>
+          <w:szCs w:val="22"/>
+        </w:rPr>
+        <w:t xml:space="preserve"> (مو صفحة عرض) ويلقى منشأة كاملة ببيانات وهمية توضّح كل قدرات النظام، ويجرب بنفسه: يسأل المساعد، يعتمد، يبني سير عمل، يرسل مسودة، يتابع الفريق.</w:t>
       </w:r>
     </w:p>
     <w:p>
@@ -9934,12 +9955,23 @@
       <w:r>
         <w:rPr>
           <w:rFonts w:ascii="Arial" w:hAnsi="Arial" w:cs="Arial"/>
+          <w:b/>
+          <w:sz w:val="22"/>
+          <w:rtl/>
+          <w:szCs w:val="22"/>
+          <w:bCs/>
+        </w:rPr>
+        <w:t>المنشأة التجريبية «Al-Waha Distribution»:</w:t>
+      </w:r>
+      <w:r>
+        <w:rPr>
+          <w:rFonts w:ascii="Arial" w:hAnsi="Arial" w:cs="Arial"/>
           <w:b w:val="0"/>
           <w:sz w:val="22"/>
           <w:rtl/>
           <w:szCs w:val="22"/>
         </w:rPr>
-        <w:t>الموردين، والفروع، ومخزون الفروع.</w:t>
+        <w:t xml:space="preserve"> 4 موردين، مستودع مركزي بـ 4 مناطق و15 رفًا ونحو 25 دفعة بصلاحيات مختلفة، 4 فروع (منها فرع تحت حد الأمان)، 7 طلبات شراء بمراحل مختلفة (منها متأخر)، 3 تحويلات، تنبيهات من كل وكيل، مبيعات 8 أسابيع، 7 موظفين بأدوار مختلفة، صندوق إيميل تجريبي (فاتورة مورد بفرق، شكوى، طلب عرض سعر)، متابعات، ومهام متأخرة، وسجل تدقيق.</w:t>
       </w:r>
     </w:p>
     <w:p>
@@ -9951,12 +9983,23 @@
       <w:r>
         <w:rPr>
           <w:rFonts w:ascii="Arial" w:hAnsi="Arial" w:cs="Arial"/>
+          <w:b/>
+          <w:sz w:val="22"/>
+          <w:rtl/>
+          <w:szCs w:val="22"/>
+          <w:bCs/>
+        </w:rPr>
+        <w:t>كل شاشة فيها شيء يُجرَّب:</w:t>
+      </w:r>
+      <w:r>
+        <w:rPr>
+          <w:rFonts w:ascii="Arial" w:hAnsi="Arial" w:cs="Arial"/>
           <w:b w:val="0"/>
           <w:sz w:val="22"/>
           <w:rtl/>
           <w:szCs w:val="22"/>
         </w:rPr>
-        <w:t>طلبات الشراء، والتحويلات، والرفوف، والدفعات.</w:t>
+        <w:t xml:space="preserve"> قرار ينتظر، استثناء، مسودة جاهزة، متابعة متأخرة، اقتراح رفع صلاحية.</w:t>
       </w:r>
     </w:p>
     <w:p>
@@ -9968,28 +10011,669 @@
       <w:r>
         <w:rPr>
           <w:rFonts w:ascii="Arial" w:hAnsi="Arial" w:cs="Arial"/>
+          <w:b/>
+          <w:sz w:val="22"/>
+          <w:rtl/>
+          <w:szCs w:val="22"/>
+          <w:bCs/>
+        </w:rPr>
+        <w:t>سير عمل جاهز ومنشور:</w:t>
+      </w:r>
+      <w:r>
+        <w:rPr>
+          <w:rFonts w:ascii="Arial" w:hAnsi="Arial" w:cs="Arial"/>
           <w:b w:val="0"/>
           <w:sz w:val="22"/>
           <w:rtl/>
           <w:szCs w:val="22"/>
         </w:rPr>
-        <w:t>التنبيهات، والقرارات، والمبيعات الأسبوعية، والإعدادات.</w:t>
+        <w:t xml:space="preserve"> تذكير المبيعات الأسبوعي، متابعة المورد قبل التسليم، اعتماد التنبيه → إنشاء تحويل.</w:t>
       </w:r>
     </w:p>
     <w:p>
       <w:pPr>
+        <w:pStyle w:val="ListBullet"/>
         <w:bidi w:val="1"/>
         <w:jc w:val="right"/>
       </w:pPr>
       <w:r>
         <w:rPr>
           <w:rFonts w:ascii="Arial" w:hAnsi="Arial" w:cs="Arial"/>
+          <w:b/>
+          <w:sz w:val="22"/>
+          <w:rtl/>
+          <w:szCs w:val="22"/>
+          <w:bCs/>
+        </w:rPr>
+        <w:t>المساعد حقيقي:</w:t>
+      </w:r>
+      <w:r>
+        <w:rPr>
+          <w:rFonts w:ascii="Arial" w:hAnsi="Arial" w:cs="Arial"/>
           <w:b w:val="0"/>
           <w:sz w:val="22"/>
           <w:rtl/>
           <w:szCs w:val="22"/>
         </w:rPr>
-        <w:t>هذي الجداول تتزامن من نظام المحاسبة، أو تتعبأ ببيانات تجريبية للديمو. ومعها سجل التدقيق وسجلات تشغيل سير العمل. والملفات، مثل الفواتير وسندات الاستلام، تنحفظ في تخزين ملفات.</w:t>
+        <w:t xml:space="preserve"> يجاوب من بيانات المنشأة التجريبية، ويبني سير عمل حقيقي يظهر حيًا في اللوحة.</w:t>
+      </w:r>
+    </w:p>
+    <w:p>
+      <w:pPr>
+        <w:pStyle w:val="ListBullet"/>
+        <w:bidi w:val="1"/>
+        <w:jc w:val="right"/>
+      </w:pPr>
+      <w:r>
+        <w:rPr>
+          <w:rFonts w:ascii="Arial" w:hAnsi="Arial" w:cs="Arial"/>
+          <w:b/>
+          <w:sz w:val="22"/>
+          <w:rtl/>
+          <w:szCs w:val="22"/>
+          <w:bCs/>
+        </w:rPr>
+        <w:t>أمان الديمو:</w:t>
+      </w:r>
+      <w:r>
+        <w:rPr>
+          <w:rFonts w:ascii="Arial" w:hAnsi="Arial" w:cs="Arial"/>
+          <w:b w:val="0"/>
+          <w:sz w:val="22"/>
+          <w:rtl/>
+          <w:szCs w:val="22"/>
+        </w:rPr>
+        <w:t xml:space="preserve"> لا تُرسل إيميلات أو رسائل خارجية حقيقية من البيانات الوهمية (الإرسال يذهب لصندوق تجريبي)؛ لا ربط بأنظمة حقيقية إلا إذا حوّل العميل لبياناته.</w:t>
+      </w:r>
+    </w:p>
+    <w:p>
+      <w:pPr>
+        <w:pStyle w:val="ListBullet"/>
+        <w:bidi w:val="1"/>
+        <w:jc w:val="right"/>
+      </w:pPr>
+      <w:r>
+        <w:rPr>
+          <w:rFonts w:ascii="Arial" w:hAnsi="Arial" w:cs="Arial"/>
+          <w:b/>
+          <w:sz w:val="22"/>
+          <w:rtl/>
+          <w:szCs w:val="22"/>
+          <w:bCs/>
+        </w:rPr>
+        <w:t>«تجربة كأي دور»:</w:t>
+      </w:r>
+      <w:r>
+        <w:rPr>
+          <w:rFonts w:ascii="Arial" w:hAnsi="Arial" w:cs="Arial"/>
+          <w:b w:val="0"/>
+          <w:sz w:val="22"/>
+          <w:rtl/>
+          <w:szCs w:val="22"/>
+        </w:rPr>
+        <w:t xml:space="preserve"> العميل يبدّل الدور (مالك، عمليات، مشتريات، مستودع، فرع، مالية، مبيعات) ويشوف الواجهة تتغيّر.</w:t>
+      </w:r>
+    </w:p>
+    <w:p>
+      <w:pPr>
+        <w:pStyle w:val="ListBullet"/>
+        <w:bidi w:val="1"/>
+        <w:jc w:val="right"/>
+      </w:pPr>
+      <w:r>
+        <w:rPr>
+          <w:rFonts w:ascii="Arial" w:hAnsi="Arial" w:cs="Arial"/>
+          <w:b/>
+          <w:sz w:val="22"/>
+          <w:rtl/>
+          <w:szCs w:val="22"/>
+          <w:bCs/>
+        </w:rPr>
+        <w:t>«إعادة ضبط الديمو»</w:t>
+      </w:r>
+      <w:r>
+        <w:rPr>
+          <w:rFonts w:ascii="Arial" w:hAnsi="Arial" w:cs="Arial"/>
+          <w:b w:val="0"/>
+          <w:sz w:val="22"/>
+          <w:rtl/>
+          <w:szCs w:val="22"/>
+        </w:rPr>
+        <w:t xml:space="preserve"> ترجع كل شي لبدايته، و</w:t>
+      </w:r>
+      <w:r>
+        <w:rPr>
+          <w:rFonts w:ascii="Arial" w:hAnsi="Arial" w:cs="Arial"/>
+          <w:b/>
+          <w:sz w:val="22"/>
+          <w:rtl/>
+          <w:szCs w:val="22"/>
+          <w:bCs/>
+        </w:rPr>
+        <w:t>«ابدأ ببياناتي»</w:t>
+      </w:r>
+      <w:r>
+        <w:rPr>
+          <w:rFonts w:ascii="Arial" w:hAnsi="Arial" w:cs="Arial"/>
+          <w:b w:val="0"/>
+          <w:sz w:val="22"/>
+          <w:rtl/>
+          <w:szCs w:val="22"/>
+        </w:rPr>
+        <w:t xml:space="preserve"> تمسح الوهمي بعد أول ربط أو رفع ملف ناجح.</w:t>
+      </w:r>
+    </w:p>
+    <w:p>
+      <w:pPr>
+        <w:pStyle w:val="ListBullet"/>
+        <w:bidi w:val="1"/>
+        <w:jc w:val="right"/>
+      </w:pPr>
+      <w:r>
+        <w:rPr>
+          <w:rFonts w:ascii="Arial" w:hAnsi="Arial" w:cs="Arial"/>
+          <w:b/>
+          <w:sz w:val="22"/>
+          <w:rtl/>
+          <w:szCs w:val="22"/>
+          <w:bCs/>
+        </w:rPr>
+        <w:t>علامة واضحة «بيانات تجريبية»</w:t>
+      </w:r>
+      <w:r>
+        <w:rPr>
+          <w:rFonts w:ascii="Arial" w:hAnsi="Arial" w:cs="Arial"/>
+          <w:b w:val="0"/>
+          <w:sz w:val="22"/>
+          <w:rtl/>
+          <w:szCs w:val="22"/>
+        </w:rPr>
+        <w:t xml:space="preserve"> في الشريط العلوي.</w:t>
+      </w:r>
+    </w:p>
+    <w:p>
+      <w:pPr>
+        <w:bidi w:val="1"/>
+        <w:jc w:val="right"/>
+      </w:pPr>
+      <w:r>
+        <w:rPr>
+          <w:rFonts w:ascii="Arial" w:hAnsi="Arial" w:cs="Arial"/>
+          <w:b/>
+          <w:sz w:val="22"/>
+          <w:rtl/>
+          <w:szCs w:val="22"/>
+          <w:bCs/>
+        </w:rPr>
+        <w:t>معيار القبول:</w:t>
+      </w:r>
+      <w:r>
+        <w:rPr>
+          <w:rFonts w:ascii="Arial" w:hAnsi="Arial" w:cs="Arial"/>
+          <w:b w:val="0"/>
+          <w:sz w:val="22"/>
+          <w:rtl/>
+          <w:szCs w:val="22"/>
+        </w:rPr>
+        <w:t xml:space="preserve"> عميل جديد يسجّل ويوصل للبرج ببيانات كاملة خلال أقل من دقيقتين، ويكمل سيناريو العرض (١٢ مشهدًا) بنفسه بدون مساعدة.</w:t>
+      </w:r>
+    </w:p>
+    <w:p>
+      <w:pPr>
+        <w:bidi w:val="1"/>
+        <w:jc w:val="right"/>
+      </w:pPr>
+      <w:r>
+        <w:rPr>
+          <w:rFonts w:ascii="Arial" w:hAnsi="Arial" w:cs="Arial"/>
+          <w:b/>
+          <w:color w:val="1663D6"/>
+          <w:sz w:val="25"/>
+          <w:rtl/>
+          <w:szCs w:val="25.0"/>
+          <w:bCs/>
+        </w:rPr>
+        <w:t>٩٫١٩ البرج والمستودع حسب بيانات العميل (P0)</w:t>
+      </w:r>
+    </w:p>
+    <w:p>
+      <w:pPr>
+        <w:pStyle w:val="ListBullet"/>
+        <w:bidi w:val="1"/>
+        <w:jc w:val="right"/>
+      </w:pPr>
+      <w:r>
+        <w:rPr>
+          <w:rFonts w:ascii="Arial" w:hAnsi="Arial" w:cs="Arial"/>
+          <w:b/>
+          <w:sz w:val="22"/>
+          <w:rtl/>
+          <w:szCs w:val="22"/>
+          <w:bCs/>
+        </w:rPr>
+        <w:t>من البيانات لا رسم ثابت:</w:t>
+      </w:r>
+      <w:r>
+        <w:rPr>
+          <w:rFonts w:ascii="Arial" w:hAnsi="Arial" w:cs="Arial"/>
+          <w:b w:val="0"/>
+          <w:sz w:val="22"/>
+          <w:rtl/>
+          <w:szCs w:val="22"/>
+        </w:rPr>
+        <w:t xml:space="preserve"> المستودعات والمناطق والرفوف من الـ ERP (رموز المواقع مثل A-01-03) أو من ملف Excel؛ الفروع والموردون بمدنهم.</w:t>
+      </w:r>
+    </w:p>
+    <w:p>
+      <w:pPr>
+        <w:pStyle w:val="ListBullet"/>
+        <w:bidi w:val="1"/>
+        <w:jc w:val="right"/>
+      </w:pPr>
+      <w:r>
+        <w:rPr>
+          <w:rFonts w:ascii="Arial" w:hAnsi="Arial" w:cs="Arial"/>
+          <w:b/>
+          <w:sz w:val="22"/>
+          <w:rtl/>
+          <w:szCs w:val="22"/>
+          <w:bCs/>
+        </w:rPr>
+        <w:t>ترتيب تلقائي ومستويات تفصيل:</w:t>
+      </w:r>
+      <w:r>
+        <w:rPr>
+          <w:rFonts w:ascii="Arial" w:hAnsi="Arial" w:cs="Arial"/>
+          <w:b w:val="0"/>
+          <w:sz w:val="22"/>
+          <w:rtl/>
+          <w:szCs w:val="22"/>
+        </w:rPr>
+        <w:t xml:space="preserve"> حتى 40 رفًا يظهر كل رف؛ 40–300 مجمّعة بالمناطق والممرات مع تكبير وتحريك؛ أكثر من 300 أو عدة مستودعات تظهر المناطق أولًا ثم الدخول للتفاصيل؛ أكثر من 15 فرعًا تُجمّع حسب المنطقة.</w:t>
+      </w:r>
+    </w:p>
+    <w:p>
+      <w:pPr>
+        <w:pStyle w:val="ListBullet"/>
+        <w:bidi w:val="1"/>
+        <w:jc w:val="right"/>
+      </w:pPr>
+      <w:r>
+        <w:rPr>
+          <w:rFonts w:ascii="Arial" w:hAnsi="Arial" w:cs="Arial"/>
+          <w:b/>
+          <w:sz w:val="22"/>
+          <w:rtl/>
+          <w:szCs w:val="22"/>
+          <w:bCs/>
+        </w:rPr>
+        <w:t>محرر تخطيط اختياري</w:t>
+      </w:r>
+      <w:r>
+        <w:rPr>
+          <w:rFonts w:ascii="Arial" w:hAnsi="Arial" w:cs="Arial"/>
+          <w:b w:val="0"/>
+          <w:sz w:val="22"/>
+          <w:rtl/>
+          <w:szCs w:val="22"/>
+        </w:rPr>
+        <w:t xml:space="preserve"> يطابق الأرضية الحقيقية.</w:t>
+      </w:r>
+    </w:p>
+    <w:p>
+      <w:pPr>
+        <w:pStyle w:val="ListBullet"/>
+        <w:bidi w:val="1"/>
+        <w:jc w:val="right"/>
+      </w:pPr>
+      <w:r>
+        <w:rPr>
+          <w:rFonts w:ascii="Arial" w:hAnsi="Arial" w:cs="Arial"/>
+          <w:b/>
+          <w:sz w:val="22"/>
+          <w:rtl/>
+          <w:szCs w:val="22"/>
+          <w:bCs/>
+        </w:rPr>
+        <w:t>الأداء:</w:t>
+      </w:r>
+      <w:r>
+        <w:rPr>
+          <w:rFonts w:ascii="Arial" w:hAnsi="Arial" w:cs="Arial"/>
+          <w:b w:val="0"/>
+          <w:sz w:val="22"/>
+          <w:rtl/>
+          <w:szCs w:val="22"/>
+        </w:rPr>
+        <w:t xml:space="preserve"> ملخصات من السيرفر بدل الصفوف كاملة، والتفاصيل عند الطلب، والتحديث عند التغيّر؛ البرج يفتح في ثانية أو أقل مع 1000 رف و40 فرعًا و50 مستخدمًا متزامنًا.</w:t>
+      </w:r>
+    </w:p>
+    <w:p>
+      <w:pPr>
+        <w:bidi w:val="1"/>
+        <w:jc w:val="right"/>
+      </w:pPr>
+      <w:r>
+        <w:rPr>
+          <w:rFonts w:ascii="Arial" w:hAnsi="Arial" w:cs="Arial"/>
+          <w:b/>
+          <w:color w:val="1663D6"/>
+          <w:sz w:val="25"/>
+          <w:rtl/>
+          <w:szCs w:val="25.0"/>
+          <w:bCs/>
+        </w:rPr>
+        <w:t>٩٫٢٠ الاشتراك والفوترة (P0 قبل أول تحويل لمدفوع)</w:t>
+      </w:r>
+    </w:p>
+    <w:p>
+      <w:pPr>
+        <w:pStyle w:val="ListBullet"/>
+        <w:bidi w:val="1"/>
+        <w:jc w:val="right"/>
+      </w:pPr>
+      <w:r>
+        <w:rPr>
+          <w:rFonts w:ascii="Arial" w:hAnsi="Arial" w:cs="Arial"/>
+          <w:b/>
+          <w:sz w:val="22"/>
+          <w:rtl/>
+          <w:szCs w:val="22"/>
+          <w:bCs/>
+        </w:rPr>
+        <w:t>التسجيل الذاتي:</w:t>
+      </w:r>
+      <w:r>
+        <w:rPr>
+          <w:rFonts w:ascii="Arial" w:hAnsi="Arial" w:cs="Arial"/>
+          <w:b w:val="0"/>
+          <w:sz w:val="22"/>
+          <w:rtl/>
+          <w:szCs w:val="22"/>
+        </w:rPr>
+        <w:t xml:space="preserve"> إنشاء المنشأة، سؤال الدور، ملف المنشأة (النشاط، الفروع، الموظفون، الـ ERP الحالي)، التحقق من الجوال.</w:t>
+      </w:r>
+    </w:p>
+    <w:p>
+      <w:pPr>
+        <w:pStyle w:val="ListBullet"/>
+        <w:bidi w:val="1"/>
+        <w:jc w:val="right"/>
+      </w:pPr>
+      <w:r>
+        <w:rPr>
+          <w:rFonts w:ascii="Arial" w:hAnsi="Arial" w:cs="Arial"/>
+          <w:b/>
+          <w:sz w:val="22"/>
+          <w:rtl/>
+          <w:szCs w:val="22"/>
+          <w:bCs/>
+        </w:rPr>
+        <w:t>التجربة 14 يومًا:</w:t>
+      </w:r>
+      <w:r>
+        <w:rPr>
+          <w:rFonts w:ascii="Arial" w:hAnsi="Arial" w:cs="Arial"/>
+          <w:b w:val="0"/>
+          <w:sz w:val="22"/>
+          <w:rtl/>
+          <w:szCs w:val="22"/>
+        </w:rPr>
+        <w:t xml:space="preserve"> شريط الأيام المتبقية، تنبيهات قبل الانتهاء، وبعده قراءة فقط بلا حذف، وتصدير البيانات.</w:t>
+      </w:r>
+    </w:p>
+    <w:p>
+      <w:pPr>
+        <w:pStyle w:val="ListBullet"/>
+        <w:bidi w:val="1"/>
+        <w:jc w:val="right"/>
+      </w:pPr>
+      <w:r>
+        <w:rPr>
+          <w:rFonts w:ascii="Arial" w:hAnsi="Arial" w:cs="Arial"/>
+          <w:b/>
+          <w:sz w:val="22"/>
+          <w:rtl/>
+          <w:szCs w:val="22"/>
+          <w:bCs/>
+        </w:rPr>
+        <w:t>الباقات والحدود مطبّقة فعليًا:</w:t>
+      </w:r>
+      <w:r>
+        <w:rPr>
+          <w:rFonts w:ascii="Arial" w:hAnsi="Arial" w:cs="Arial"/>
+          <w:b w:val="0"/>
+          <w:sz w:val="22"/>
+          <w:rtl/>
+          <w:szCs w:val="22"/>
+        </w:rPr>
+        <w:t xml:space="preserve"> المستخدمون، الوكلاء، التكاملات، التشغيلات؛ صفحة استهلاك وتنبيه عند 80٪.</w:t>
+      </w:r>
+    </w:p>
+    <w:p>
+      <w:pPr>
+        <w:pStyle w:val="ListBullet"/>
+        <w:bidi w:val="1"/>
+        <w:jc w:val="right"/>
+      </w:pPr>
+      <w:r>
+        <w:rPr>
+          <w:rFonts w:ascii="Arial" w:hAnsi="Arial" w:cs="Arial"/>
+          <w:b/>
+          <w:sz w:val="22"/>
+          <w:rtl/>
+          <w:szCs w:val="22"/>
+          <w:bCs/>
+        </w:rPr>
+        <w:t>الدفع:</w:t>
+      </w:r>
+      <w:r>
+        <w:rPr>
+          <w:rFonts w:ascii="Arial" w:hAnsi="Arial" w:cs="Arial"/>
+          <w:b w:val="0"/>
+          <w:sz w:val="22"/>
+          <w:rtl/>
+          <w:szCs w:val="22"/>
+        </w:rPr>
+        <w:t xml:space="preserve"> بوابة سعودية (Moyasar أولًا) بمدى وApple Pay وSTC Pay والبطاقات، تجديد تلقائي، إعادة محاولة عند الفشل.</w:t>
+      </w:r>
+    </w:p>
+    <w:p>
+      <w:pPr>
+        <w:pStyle w:val="ListBullet"/>
+        <w:bidi w:val="1"/>
+        <w:jc w:val="right"/>
+      </w:pPr>
+      <w:r>
+        <w:rPr>
+          <w:rFonts w:ascii="Arial" w:hAnsi="Arial" w:cs="Arial"/>
+          <w:b/>
+          <w:sz w:val="22"/>
+          <w:rtl/>
+          <w:szCs w:val="22"/>
+          <w:bCs/>
+        </w:rPr>
+        <w:t>الفواتير:</w:t>
+      </w:r>
+      <w:r>
+        <w:rPr>
+          <w:rFonts w:ascii="Arial" w:hAnsi="Arial" w:cs="Arial"/>
+          <w:b w:val="0"/>
+          <w:sz w:val="22"/>
+          <w:rtl/>
+          <w:szCs w:val="22"/>
+        </w:rPr>
+        <w:t xml:space="preserve"> ضريبة القيمة المضافة 15٪ وفاتورة إلكترونية متوافقة مع هيئة الزكاة والضريبة والجمارك.</w:t>
+      </w:r>
+    </w:p>
+    <w:p>
+      <w:pPr>
+        <w:pStyle w:val="ListBullet"/>
+        <w:bidi w:val="1"/>
+        <w:jc w:val="right"/>
+      </w:pPr>
+      <w:r>
+        <w:rPr>
+          <w:rFonts w:ascii="Arial" w:hAnsi="Arial" w:cs="Arial"/>
+          <w:b/>
+          <w:sz w:val="22"/>
+          <w:rtl/>
+          <w:szCs w:val="22"/>
+          <w:bCs/>
+        </w:rPr>
+        <w:t>إيميلات آلية:</w:t>
+      </w:r>
+      <w:r>
+        <w:rPr>
+          <w:rFonts w:ascii="Arial" w:hAnsi="Arial" w:cs="Arial"/>
+          <w:b w:val="0"/>
+          <w:sz w:val="22"/>
+          <w:rtl/>
+          <w:szCs w:val="22"/>
+        </w:rPr>
+        <w:t xml:space="preserve"> ترحيب، دعوات، تنبيهات التجربة، إيصالات وفشل الدفع، ملخص أسبوعي.</w:t>
+      </w:r>
+    </w:p>
+    <w:p>
+      <w:pPr>
+        <w:pStyle w:val="ListBullet"/>
+        <w:bidi w:val="1"/>
+        <w:jc w:val="right"/>
+      </w:pPr>
+      <w:r>
+        <w:rPr>
+          <w:rFonts w:ascii="Arial" w:hAnsi="Arial" w:cs="Arial"/>
+          <w:b/>
+          <w:sz w:val="22"/>
+          <w:rtl/>
+          <w:szCs w:val="22"/>
+          <w:bCs/>
+        </w:rPr>
+        <w:t>لوحة إدارة داخلية لفيونكس:</w:t>
+      </w:r>
+      <w:r>
+        <w:rPr>
+          <w:rFonts w:ascii="Arial" w:hAnsi="Arial" w:cs="Arial"/>
+          <w:b w:val="0"/>
+          <w:sz w:val="22"/>
+          <w:rtl/>
+          <w:szCs w:val="22"/>
+        </w:rPr>
+        <w:t xml:space="preserve"> المنشآت، الباقة، حالة التجربة، الإيرادات الشهرية، الاستخدام، تكلفة الذكاء الاصطناعي لكل منشأة، تمديد التجربة.</w:t>
+      </w:r>
+    </w:p>
+    <w:p>
+      <w:pPr>
+        <w:pStyle w:val="ListBullet"/>
+        <w:bidi w:val="1"/>
+        <w:jc w:val="right"/>
+      </w:pPr>
+      <w:r>
+        <w:rPr>
+          <w:rFonts w:ascii="Arial" w:hAnsi="Arial" w:cs="Arial"/>
+          <w:b/>
+          <w:sz w:val="22"/>
+          <w:rtl/>
+          <w:szCs w:val="22"/>
+          <w:bCs/>
+        </w:rPr>
+        <w:t>الشروط والخصوصية</w:t>
+      </w:r>
+      <w:r>
+        <w:rPr>
+          <w:rFonts w:ascii="Arial" w:hAnsi="Arial" w:cs="Arial"/>
+          <w:b w:val="0"/>
+          <w:sz w:val="22"/>
+          <w:rtl/>
+          <w:szCs w:val="22"/>
+        </w:rPr>
+        <w:t xml:space="preserve"> متوافقة مع نظام حماية البيانات الشخصية، وموافقة عند التسجيل.</w:t>
+      </w:r>
+    </w:p>
+    <w:p>
+      <w:pPr>
+        <w:bidi w:val="1"/>
+        <w:jc w:val="right"/>
+      </w:pPr>
+      <w:r>
+        <w:rPr>
+          <w:rFonts w:ascii="Arial" w:hAnsi="Arial" w:cs="Arial"/>
+          <w:b/>
+          <w:color w:val="1663D6"/>
+          <w:sz w:val="25"/>
+          <w:rtl/>
+          <w:szCs w:val="25.0"/>
+          <w:bCs/>
+        </w:rPr>
+        <w:t>٩٫٢١ الاستقرار والاعتمادية (P0)</w:t>
+      </w:r>
+    </w:p>
+    <w:p>
+      <w:pPr>
+        <w:pStyle w:val="ListBullet"/>
+        <w:bidi w:val="1"/>
+        <w:jc w:val="right"/>
+      </w:pPr>
+      <w:r>
+        <w:rPr>
+          <w:rFonts w:ascii="Arial" w:hAnsi="Arial" w:cs="Arial"/>
+          <w:b w:val="0"/>
+          <w:sz w:val="22"/>
+          <w:rtl/>
+          <w:szCs w:val="22"/>
+        </w:rPr>
+        <w:t>بيئة اختبار منفصلة، واختبار آلي للرحلة كاملة يوقف النشر عند الفشل، ونشر بإصدارات مرقمة مع رجوع خلال دقيقة.</w:t>
+      </w:r>
+    </w:p>
+    <w:p>
+      <w:pPr>
+        <w:pStyle w:val="ListBullet"/>
+        <w:bidi w:val="1"/>
+        <w:jc w:val="right"/>
+      </w:pPr>
+      <w:r>
+        <w:rPr>
+          <w:rFonts w:ascii="Arial" w:hAnsi="Arial" w:cs="Arial"/>
+          <w:b w:val="0"/>
+          <w:sz w:val="22"/>
+          <w:rtl/>
+          <w:szCs w:val="22"/>
+        </w:rPr>
+        <w:t>مراقبة كل دقيقة وتنبيه، ونسخ احتياطي ثانٍ على سيرفر آخر، واختبار استعادة شهري، ونسخة حية لقاعدة البيانات.</w:t>
+      </w:r>
+    </w:p>
+    <w:p>
+      <w:pPr>
+        <w:pStyle w:val="ListBullet"/>
+        <w:bidi w:val="1"/>
+        <w:jc w:val="right"/>
+      </w:pPr>
+      <w:r>
+        <w:rPr>
+          <w:rFonts w:ascii="Arial" w:hAnsi="Arial" w:cs="Arial"/>
+          <w:b w:val="0"/>
+          <w:sz w:val="22"/>
+          <w:rtl/>
+          <w:szCs w:val="22"/>
+        </w:rPr>
+        <w:t>حدود استخدام لكل منشأة، وفصل تشغيل سير العمل عن الواجهة، واختبار تحمّل قبل الإطلاق.</w:t>
+      </w:r>
+    </w:p>
+    <w:p>
+      <w:pPr>
+        <w:pStyle w:val="ListBullet"/>
+        <w:bidi w:val="1"/>
+        <w:jc w:val="right"/>
+      </w:pPr>
+      <w:r>
+        <w:rPr>
+          <w:rFonts w:ascii="Arial" w:hAnsi="Arial" w:cs="Arial"/>
+          <w:b w:val="0"/>
+          <w:sz w:val="22"/>
+          <w:rtl/>
+          <w:szCs w:val="22"/>
+        </w:rPr>
+        <w:t>تنبيه رصيد مزود الذكاء الاصطناعي، و«تجميد العرض» يوم العروض، وسجل أخطاء يومي.</w:t>
       </w:r>
     </w:p>
     <w:p>
@@ -10007,7 +10691,23 @@
           <w:szCs w:val="30"/>
           <w:bCs/>
         </w:rPr>
-        <w:t>١١. المتطلبات غير الوظيفية</w:t>
+        <w:t>١٠. البيانات</w:t>
+      </w:r>
+    </w:p>
+    <w:p>
+      <w:pPr>
+        <w:bidi w:val="1"/>
+        <w:jc w:val="right"/>
+      </w:pPr>
+      <w:r>
+        <w:rPr>
+          <w:rFonts w:ascii="Arial" w:hAnsi="Arial" w:cs="Arial"/>
+          <w:b w:val="0"/>
+          <w:sz w:val="22"/>
+          <w:rtl/>
+          <w:szCs w:val="22"/>
+        </w:rPr>
+        <w:t>المرجع الأساسي للبيانات يبقى نظام المحاسبة. Boynt يحتفظ بجداول تشغيلية:</w:t>
       </w:r>
     </w:p>
     <w:p>
@@ -10019,23 +10719,12 @@
       <w:r>
         <w:rPr>
           <w:rFonts w:ascii="Arial" w:hAnsi="Arial" w:cs="Arial"/>
-          <w:b/>
-          <w:sz w:val="22"/>
-          <w:rtl/>
-          <w:szCs w:val="22"/>
-          <w:bCs/>
-        </w:rPr>
-        <w:t>الأمان:</w:t>
-      </w:r>
-      <w:r>
-        <w:rPr>
-          <w:rFonts w:ascii="Arial" w:hAnsi="Arial" w:cs="Arial"/>
           <w:b w:val="0"/>
           <w:sz w:val="22"/>
           <w:rtl/>
           <w:szCs w:val="22"/>
         </w:rPr>
-        <w:t xml:space="preserve"> صلاحيات حسب الدور، وصلاحيات لكل تكامل، وتدقيق كل إجراء من الوكلاء وكل اعتماد، وتشفير بيانات الاعتماد، وما تظهر الأسرار في الواجهة أبدًا.</w:t>
+        <w:t>الموردين، والفروع، ومخزون الفروع.</w:t>
       </w:r>
     </w:p>
     <w:p>
@@ -10047,23 +10736,12 @@
       <w:r>
         <w:rPr>
           <w:rFonts w:ascii="Arial" w:hAnsi="Arial" w:cs="Arial"/>
-          <w:b/>
-          <w:sz w:val="22"/>
-          <w:rtl/>
-          <w:szCs w:val="22"/>
-          <w:bCs/>
-        </w:rPr>
-        <w:t>الخصوصية:</w:t>
-      </w:r>
-      <w:r>
-        <w:rPr>
-          <w:rFonts w:ascii="Arial" w:hAnsi="Arial" w:cs="Arial"/>
           <w:b w:val="0"/>
           <w:sz w:val="22"/>
           <w:rtl/>
           <w:szCs w:val="22"/>
         </w:rPr>
-        <w:t xml:space="preserve"> معالجة متوافقة مع نظام حماية البيانات الشخصية، والبيانات تبقى داخل مساحة عمل المنشأة. ولا ندّعي إن الاستضافة داخل المملكة إلا إذا كان النشر فعلًا كذلك.</w:t>
+        <w:t>طلبات الشراء، والتحويلات، والرفوف، والدفعات.</w:t>
       </w:r>
     </w:p>
     <w:p>
@@ -10075,23 +10753,46 @@
       <w:r>
         <w:rPr>
           <w:rFonts w:ascii="Arial" w:hAnsi="Arial" w:cs="Arial"/>
+          <w:b w:val="0"/>
+          <w:sz w:val="22"/>
+          <w:rtl/>
+          <w:szCs w:val="22"/>
+        </w:rPr>
+        <w:t>التنبيهات، والقرارات، والمبيعات الأسبوعية، والإعدادات.</w:t>
+      </w:r>
+    </w:p>
+    <w:p>
+      <w:pPr>
+        <w:bidi w:val="1"/>
+        <w:jc w:val="right"/>
+      </w:pPr>
+      <w:r>
+        <w:rPr>
+          <w:rFonts w:ascii="Arial" w:hAnsi="Arial" w:cs="Arial"/>
+          <w:b w:val="0"/>
+          <w:sz w:val="22"/>
+          <w:rtl/>
+          <w:szCs w:val="22"/>
+        </w:rPr>
+        <w:t>هذي الجداول تتزامن من نظام المحاسبة، أو تتعبأ ببيانات تجريبية للديمو. ومعها سجل التدقيق وسجلات تشغيل سير العمل. والملفات، مثل الفواتير وسندات الاستلام، تنحفظ في تخزين ملفات.</w:t>
+      </w:r>
+    </w:p>
+    <w:p>
+      <w:pPr>
+        <w:bidi w:val="1"/>
+        <w:jc w:val="right"/>
+      </w:pPr>
+      <w:r>
+        <w:rPr>
+          <w:rFonts w:ascii="Arial" w:hAnsi="Arial" w:cs="Arial"/>
           <w:b/>
-          <w:sz w:val="22"/>
-          <w:rtl/>
-          <w:szCs w:val="22"/>
+          <w:color w:val="006A5B"/>
+          <w:sz w:val="30"/>
+          <w:rtl/>
+          <w:szCs w:val="30"/>
           <w:bCs/>
         </w:rPr>
-        <w:t>الأداء:</w:t>
-      </w:r>
-      <w:r>
-        <w:rPr>
-          <w:rFonts w:ascii="Arial" w:hAnsi="Arial" w:cs="Arial"/>
-          <w:b w:val="0"/>
-          <w:sz w:val="22"/>
-          <w:rtl/>
-          <w:szCs w:val="22"/>
-        </w:rPr>
-        <w:t xml:space="preserve"> الشاشات تنفتح في أقل من ثانية مع ١٠٬٠٠٠ صف، وأول رد من المساعد في أقل من ثانيتين.</w:t>
+        <w:t>١١. المتطلبات غير الوظيفية</w:t>
       </w:r>
     </w:p>
     <w:p>
@@ -10109,7 +10810,7 @@
           <w:szCs w:val="22"/>
           <w:bCs/>
         </w:rPr>
-        <w:t>التوفر:</w:t>
+        <w:t>الأمان:</w:t>
       </w:r>
       <w:r>
         <w:rPr>
@@ -10119,7 +10820,7 @@
           <w:rtl/>
           <w:szCs w:val="22"/>
         </w:rPr>
-        <w:t xml:space="preserve"> ٩٩٫٥٪ في التجربة، ونسخ احتياطية ليلية تُحفظ ٧ أيام.</w:t>
+        <w:t xml:space="preserve"> صلاحيات حسب الدور، وصلاحيات لكل تكامل، وتدقيق كل إجراء من الوكلاء وكل اعتماد، وتشفير بيانات الاعتماد، وما تظهر الأسرار في الواجهة أبدًا.</w:t>
       </w:r>
     </w:p>
     <w:p>
@@ -10137,6 +10838,90 @@
           <w:szCs w:val="22"/>
           <w:bCs/>
         </w:rPr>
+        <w:t>الخصوصية:</w:t>
+      </w:r>
+      <w:r>
+        <w:rPr>
+          <w:rFonts w:ascii="Arial" w:hAnsi="Arial" w:cs="Arial"/>
+          <w:b w:val="0"/>
+          <w:sz w:val="22"/>
+          <w:rtl/>
+          <w:szCs w:val="22"/>
+        </w:rPr>
+        <w:t xml:space="preserve"> معالجة متوافقة مع نظام حماية البيانات الشخصية، والبيانات تبقى داخل مساحة عمل المنشأة. ولا ندّعي إن الاستضافة داخل المملكة إلا إذا كان النشر فعلًا كذلك.</w:t>
+      </w:r>
+    </w:p>
+    <w:p>
+      <w:pPr>
+        <w:pStyle w:val="ListBullet"/>
+        <w:bidi w:val="1"/>
+        <w:jc w:val="right"/>
+      </w:pPr>
+      <w:r>
+        <w:rPr>
+          <w:rFonts w:ascii="Arial" w:hAnsi="Arial" w:cs="Arial"/>
+          <w:b/>
+          <w:sz w:val="22"/>
+          <w:rtl/>
+          <w:szCs w:val="22"/>
+          <w:bCs/>
+        </w:rPr>
+        <w:t>الأداء:</w:t>
+      </w:r>
+      <w:r>
+        <w:rPr>
+          <w:rFonts w:ascii="Arial" w:hAnsi="Arial" w:cs="Arial"/>
+          <w:b w:val="0"/>
+          <w:sz w:val="22"/>
+          <w:rtl/>
+          <w:szCs w:val="22"/>
+        </w:rPr>
+        <w:t xml:space="preserve"> الشاشات تنفتح في أقل من ثانية مع ١٠٬٠٠٠ صف، وأول رد من المساعد في أقل من ثانيتين.</w:t>
+      </w:r>
+    </w:p>
+    <w:p>
+      <w:pPr>
+        <w:pStyle w:val="ListBullet"/>
+        <w:bidi w:val="1"/>
+        <w:jc w:val="right"/>
+      </w:pPr>
+      <w:r>
+        <w:rPr>
+          <w:rFonts w:ascii="Arial" w:hAnsi="Arial" w:cs="Arial"/>
+          <w:b/>
+          <w:sz w:val="22"/>
+          <w:rtl/>
+          <w:szCs w:val="22"/>
+          <w:bCs/>
+        </w:rPr>
+        <w:t>التوفر:</w:t>
+      </w:r>
+      <w:r>
+        <w:rPr>
+          <w:rFonts w:ascii="Arial" w:hAnsi="Arial" w:cs="Arial"/>
+          <w:b w:val="0"/>
+          <w:sz w:val="22"/>
+          <w:rtl/>
+          <w:szCs w:val="22"/>
+        </w:rPr>
+        <w:t xml:space="preserve"> ٩٩٫٥٪ في التجربة، ونسخ احتياطية ليلية تُحفظ ٧ أيام.</w:t>
+      </w:r>
+    </w:p>
+    <w:p>
+      <w:pPr>
+        <w:pStyle w:val="ListBullet"/>
+        <w:bidi w:val="1"/>
+        <w:jc w:val="right"/>
+      </w:pPr>
+      <w:r>
+        <w:rPr>
+          <w:rFonts w:ascii="Arial" w:hAnsi="Arial" w:cs="Arial"/>
+          <w:b/>
+          <w:sz w:val="22"/>
+          <w:rtl/>
+          <w:szCs w:val="22"/>
+          <w:bCs/>
+        </w:rPr>
         <w:t>الرخصة:</w:t>
       </w:r>
       <w:r>
@@ -10147,7 +10932,7 @@
           <w:rtl/>
           <w:szCs w:val="22"/>
         </w:rPr>
-        <w:t xml:space="preserve"> هذي المزايا من الإصدار المدفوع للمنصة: الصلاحيات حسب الدور، والتحكم بالأدوات، ومجموعات بيانات الاعتماد، وسجل التدقيق، والدخول الموحد. الديمو يستخدمها للتقييم. وقبل التشغيل الفعلي عند العملاء، لازم يكون أحد شيئين: اشتراك Enterprise، أو بدائل نظيفة من بنائنا، وهذي مخطط لها الأسبوع الجاي.</w:t>
+        <w:t xml:space="preserve"> المزايا المدفوعة في Sim (الصلاحيات التفصيلية، مجموعات بيانات الاعتماد، سجل التدقيق، الدخول الموحد، SCIM، العلامة البيضاء…) تُستخدم كما هي أثناء البناء والتقييم فقط، وتُستبدل ببدائل نظيفة من بنائنا (بنفس اللغة والأدوات، وأخف وأقوى وأكثر اعتمادية واختبارات أقوى، مع مقارنة مباشرة بالأصلي) قبل أول عميل حقيقي، ثم يُحذف كود الإصدار المدفوع من Boynt.</w:t>
       </w:r>
     </w:p>
     <w:p>
@@ -10425,7 +11210,220 @@
           <w:szCs w:val="30"/>
           <w:bCs/>
         </w:rPr>
-        <w:t>١٣. خطة الإصدارات</w:t>
+        <w:t>١٣. المخاطر والأسئلة المفتوحة</w:t>
+      </w:r>
+    </w:p>
+    <w:p>
+      <w:pPr>
+        <w:pStyle w:val="ListBullet"/>
+        <w:bidi w:val="1"/>
+        <w:jc w:val="right"/>
+      </w:pPr>
+      <w:r>
+        <w:rPr>
+          <w:rFonts w:ascii="Arial" w:hAnsi="Arial" w:cs="Arial"/>
+          <w:b/>
+          <w:sz w:val="22"/>
+          <w:rtl/>
+          <w:szCs w:val="22"/>
+          <w:bCs/>
+        </w:rPr>
+        <w:t>نظام العميل:</w:t>
+      </w:r>
+      <w:r>
+        <w:rPr>
+          <w:rFonts w:ascii="Arial" w:hAnsi="Arial" w:cs="Arial"/>
+          <w:b w:val="0"/>
+          <w:sz w:val="22"/>
+          <w:rtl/>
+          <w:szCs w:val="22"/>
+        </w:rPr>
+        <w:t xml:space="preserve"> أي نظام محاسبة يستخدم، وأي إصدار، ووين استضافته، وكم سنة من البيانات التاريخية عنده.</w:t>
+      </w:r>
+    </w:p>
+    <w:p>
+      <w:pPr>
+        <w:pStyle w:val="ListBullet"/>
+        <w:bidi w:val="1"/>
+        <w:jc w:val="right"/>
+      </w:pPr>
+      <w:r>
+        <w:rPr>
+          <w:rFonts w:ascii="Arial" w:hAnsi="Arial" w:cs="Arial"/>
+          <w:b/>
+          <w:sz w:val="22"/>
+          <w:rtl/>
+          <w:szCs w:val="22"/>
+          <w:bCs/>
+        </w:rPr>
+        <w:t>الاعتمادات:</w:t>
+      </w:r>
+      <w:r>
+        <w:rPr>
+          <w:rFonts w:ascii="Arial" w:hAnsi="Arial" w:cs="Arial"/>
+          <w:b w:val="0"/>
+          <w:sz w:val="22"/>
+          <w:rtl/>
+          <w:szCs w:val="22"/>
+        </w:rPr>
+        <w:t xml:space="preserve"> مين يعتمد وش، وكم حد كل دور بالريال.</w:t>
+      </w:r>
+    </w:p>
+    <w:p>
+      <w:pPr>
+        <w:pStyle w:val="ListBullet"/>
+        <w:bidi w:val="1"/>
+        <w:jc w:val="right"/>
+      </w:pPr>
+      <w:r>
+        <w:rPr>
+          <w:rFonts w:ascii="Arial" w:hAnsi="Arial" w:cs="Arial"/>
+          <w:b/>
+          <w:sz w:val="22"/>
+          <w:rtl/>
+          <w:szCs w:val="22"/>
+          <w:bCs/>
+        </w:rPr>
+        <w:t>القنوات:</w:t>
+      </w:r>
+      <w:r>
+        <w:rPr>
+          <w:rFonts w:ascii="Arial" w:hAnsi="Arial" w:cs="Arial"/>
+          <w:b w:val="0"/>
+          <w:sz w:val="22"/>
+          <w:rtl/>
+          <w:szCs w:val="22"/>
+        </w:rPr>
+        <w:t xml:space="preserve"> أي قنوات تعتمدها المنشأة (إيميل، Teams، واتساب)؛ وإن اختارت واتساب: رقم واتساب للأعمال ومدة توثيقه عند Meta.</w:t>
+      </w:r>
+    </w:p>
+    <w:p>
+      <w:pPr>
+        <w:pStyle w:val="ListBullet"/>
+        <w:bidi w:val="1"/>
+        <w:jc w:val="right"/>
+      </w:pPr>
+      <w:r>
+        <w:rPr>
+          <w:rFonts w:ascii="Arial" w:hAnsi="Arial" w:cs="Arial"/>
+          <w:b/>
+          <w:sz w:val="22"/>
+          <w:rtl/>
+          <w:szCs w:val="22"/>
+          <w:bCs/>
+        </w:rPr>
+        <w:t>الكتابة في النظام:</w:t>
+      </w:r>
+      <w:r>
+        <w:rPr>
+          <w:rFonts w:ascii="Arial" w:hAnsi="Arial" w:cs="Arial"/>
+          <w:b w:val="0"/>
+          <w:sz w:val="22"/>
+          <w:rtl/>
+          <w:szCs w:val="22"/>
+        </w:rPr>
+        <w:t xml:space="preserve"> هل الإدارة تبي الوكلاء يكتبون في نظام المحاسبة من الأسبوع الثاني، أو يبقون قراءة فقط لفترة أطول.</w:t>
+      </w:r>
+    </w:p>
+    <w:p>
+      <w:pPr>
+        <w:pStyle w:val="ListBullet"/>
+        <w:bidi w:val="1"/>
+        <w:jc w:val="right"/>
+      </w:pPr>
+      <w:r>
+        <w:rPr>
+          <w:rFonts w:ascii="Arial" w:hAnsi="Arial" w:cs="Arial"/>
+          <w:b/>
+          <w:sz w:val="22"/>
+          <w:rtl/>
+          <w:szCs w:val="22"/>
+          <w:bCs/>
+        </w:rPr>
+        <w:t>جودة البيانات:</w:t>
+      </w:r>
+      <w:r>
+        <w:rPr>
+          <w:rFonts w:ascii="Arial" w:hAnsi="Arial" w:cs="Arial"/>
+          <w:b w:val="0"/>
+          <w:sz w:val="22"/>
+          <w:rtl/>
+          <w:szCs w:val="22"/>
+        </w:rPr>
+        <w:t xml:space="preserve"> إذا كانت البيانات في نظام المحاسبة ضعيفة، تقل دقة التوقعات. فلازم وكيل التخطيط يرفض التوقع إذا كان التاريخ قصير.</w:t>
+      </w:r>
+    </w:p>
+    <w:p>
+      <w:pPr>
+        <w:pStyle w:val="ListBullet"/>
+        <w:bidi w:val="1"/>
+        <w:jc w:val="right"/>
+      </w:pPr>
+      <w:r>
+        <w:rPr>
+          <w:rFonts w:ascii="Arial" w:hAnsi="Arial" w:cs="Arial"/>
+          <w:b/>
+          <w:sz w:val="22"/>
+          <w:rtl/>
+          <w:szCs w:val="22"/>
+          <w:bCs/>
+        </w:rPr>
+        <w:t>الرخصة:</w:t>
+      </w:r>
+      <w:r>
+        <w:rPr>
+          <w:rFonts w:ascii="Arial" w:hAnsi="Arial" w:cs="Arial"/>
+          <w:b w:val="0"/>
+          <w:sz w:val="22"/>
+          <w:rtl/>
+          <w:szCs w:val="22"/>
+        </w:rPr>
+        <w:t xml:space="preserve"> لازم نحسم طريق مزايا الإصدار المدفوع (اشتراك أو بدائل نظيفة) قبل التشغيل الفعلي.</w:t>
+      </w:r>
+    </w:p>
+    <w:p>
+      <w:pPr>
+        <w:bidi w:val="1"/>
+        <w:jc w:val="right"/>
+      </w:pPr>
+      <w:r>
+        <w:rPr>
+          <w:rFonts w:ascii="Arial" w:hAnsi="Arial" w:cs="Arial"/>
+          <w:b/>
+          <w:color w:val="006A5B"/>
+          <w:sz w:val="30"/>
+          <w:rtl/>
+          <w:szCs w:val="30"/>
+          <w:bCs/>
+        </w:rPr>
+        <w:t>١٤. الخطة والمراحل (تُعتمد قبل البناء)</w:t>
+      </w:r>
+    </w:p>
+    <w:p>
+      <w:pPr>
+        <w:bidi w:val="1"/>
+        <w:jc w:val="right"/>
+      </w:pPr>
+      <w:r>
+        <w:rPr>
+          <w:rFonts w:ascii="Arial" w:hAnsi="Arial" w:cs="Arial"/>
+          <w:b/>
+          <w:sz w:val="22"/>
+          <w:rtl/>
+          <w:szCs w:val="22"/>
+          <w:bCs/>
+        </w:rPr>
+        <w:t>التواريخ:</w:t>
+      </w:r>
+      <w:r>
+        <w:rPr>
+          <w:rFonts w:ascii="Arial" w:hAnsi="Arial" w:cs="Arial"/>
+          <w:b w:val="0"/>
+          <w:sz w:val="22"/>
+          <w:rtl/>
+          <w:szCs w:val="22"/>
+        </w:rPr>
+        <w:t xml:space="preserve"> الجاهزية 5 نوفمبر 2026 · تجربة داخلية 6–14 نوفمبر · الإطلاق 15 نوفمبر · أول تحويل لمدفوع حوالي 29 نوفمبر.</w:t>
       </w:r>
     </w:p>
     <w:tbl>
@@ -10436,14 +11434,16 @@
         <w:bidiVisual/>
       </w:tblPr>
       <w:tblGrid>
-        <w:gridCol w:w="2880"/>
-        <w:gridCol w:w="2880"/>
-        <w:gridCol w:w="2880"/>
+        <w:gridCol w:w="1728"/>
+        <w:gridCol w:w="1728"/>
+        <w:gridCol w:w="1728"/>
+        <w:gridCol w:w="1728"/>
+        <w:gridCol w:w="1728"/>
       </w:tblGrid>
       <w:tr>
         <w:tc>
           <w:tcPr>
-            <w:tcW w:type="dxa" w:w="2880"/>
+            <w:tcW w:type="dxa" w:w="1728"/>
           </w:tcPr>
           <w:p>
             <w:pPr>
@@ -10459,13 +11459,13 @@
                 <w:szCs w:val="20"/>
                 <w:bCs/>
               </w:rPr>
-              <w:t>الإصدار</w:t>
+              <w:t>المرحلة</w:t>
             </w:r>
           </w:p>
         </w:tc>
         <w:tc>
           <w:tcPr>
-            <w:tcW w:type="dxa" w:w="2880"/>
+            <w:tcW w:type="dxa" w:w="1728"/>
           </w:tcPr>
           <w:p>
             <w:pPr>
@@ -10481,13 +11481,57 @@
                 <w:szCs w:val="20"/>
                 <w:bCs/>
               </w:rPr>
-              <w:t>النطاق</w:t>
+              <w:t>ما يُسلَّم</w:t>
             </w:r>
           </w:p>
         </w:tc>
         <w:tc>
           <w:tcPr>
-            <w:tcW w:type="dxa" w:w="2880"/>
+            <w:tcW w:type="dxa" w:w="1728"/>
+          </w:tcPr>
+          <w:p>
+            <w:pPr>
+              <w:bidi w:val="1"/>
+              <w:jc w:val="right"/>
+            </w:pPr>
+            <w:r>
+              <w:rPr>
+                <w:rFonts w:ascii="Arial" w:hAnsi="Arial" w:cs="Arial"/>
+                <w:b/>
+                <w:sz w:val="20"/>
+                <w:rtl/>
+                <w:szCs w:val="20"/>
+                <w:bCs/>
+              </w:rPr>
+              <w:t>يعتمد على</w:t>
+            </w:r>
+          </w:p>
+        </w:tc>
+        <w:tc>
+          <w:tcPr>
+            <w:tcW w:type="dxa" w:w="1728"/>
+          </w:tcPr>
+          <w:p>
+            <w:pPr>
+              <w:bidi w:val="1"/>
+              <w:jc w:val="right"/>
+            </w:pPr>
+            <w:r>
+              <w:rPr>
+                <w:rFonts w:ascii="Arial" w:hAnsi="Arial" w:cs="Arial"/>
+                <w:b/>
+                <w:sz w:val="20"/>
+                <w:rtl/>
+                <w:szCs w:val="20"/>
+                <w:bCs/>
+              </w:rPr>
+              <w:t>معيار الانتهاء</w:t>
+            </w:r>
+          </w:p>
+        </w:tc>
+        <w:tc>
+          <w:tcPr>
+            <w:tcW w:type="dxa" w:w="1728"/>
           </w:tcPr>
           <w:p>
             <w:pPr>
@@ -10511,7 +11555,7 @@
       <w:tr>
         <w:tc>
           <w:tcPr>
-            <w:tcW w:type="dxa" w:w="2880"/>
+            <w:tcW w:type="dxa" w:w="1728"/>
           </w:tcPr>
           <w:p>
             <w:pPr>
@@ -10526,13 +11570,13 @@
                 <w:rtl/>
                 <w:szCs w:val="20"/>
               </w:rPr>
-              <w:t>النموذج التصميمي</w:t>
+              <w:t>٠. الأساس</w:t>
             </w:r>
           </w:p>
         </w:tc>
         <w:tc>
           <w:tcPr>
-            <w:tcW w:type="dxa" w:w="2880"/>
+            <w:tcW w:type="dxa" w:w="1728"/>
           </w:tcPr>
           <w:p>
             <w:pPr>
@@ -10547,13 +11591,13 @@
                 <w:rtl/>
                 <w:szCs w:val="20"/>
               </w:rPr>
-              <w:t>كل الشاشات بـ HTML، ببيانات تجريبية ومساعد بردود مكتوبة</w:t>
+              <w:t>التقسيم 33/67 مع اللوحة الثابتة (منجز)، مفتاح Boynt والمسارات (منجز)، طبقة البيانات والملخصات، الهوية البصرية على كل النظام</w:t>
             </w:r>
           </w:p>
         </w:tc>
         <w:tc>
           <w:tcPr>
-            <w:tcW w:type="dxa" w:w="2880"/>
+            <w:tcW w:type="dxa" w:w="1728"/>
           </w:tcPr>
           <w:p>
             <w:pPr>
@@ -10568,15 +11612,13 @@
                 <w:rtl/>
                 <w:szCs w:val="20"/>
               </w:rPr>
-              <w:t>هذا الأسبوع</w:t>
+              <w:t>—</w:t>
             </w:r>
           </w:p>
         </w:tc>
-      </w:tr>
-      <w:tr>
         <w:tc>
           <w:tcPr>
-            <w:tcW w:type="dxa" w:w="2880"/>
+            <w:tcW w:type="dxa" w:w="1728"/>
           </w:tcPr>
           <w:p>
             <w:pPr>
@@ -10591,13 +11633,13 @@
                 <w:rtl/>
                 <w:szCs w:val="20"/>
               </w:rPr>
-              <w:t>الديمو داخل النظام</w:t>
+              <w:t>فحص الأنواع والبناء ناجحان، والمراجعة المستقلة توافق</w:t>
             </w:r>
           </w:p>
         </w:tc>
         <w:tc>
           <w:tcPr>
-            <w:tcW w:type="dxa" w:w="2880"/>
+            <w:tcW w:type="dxa" w:w="1728"/>
           </w:tcPr>
           <w:p>
             <w:pPr>
@@ -10612,13 +11654,15 @@
                 <w:rtl/>
                 <w:szCs w:val="20"/>
               </w:rPr>
-              <w:t>التقسيم، والهوية، والبرج، والمستودع، والموافقات، والوكلاء، والبناء الحي لسير العمل، والتكاملات، ولوحة الإدارة، على app.boynt.io ببيانات تجريبية</w:t>
+              <w:t>1 نوفمبر</w:t>
             </w:r>
           </w:p>
         </w:tc>
+      </w:tr>
+      <w:tr>
         <w:tc>
           <w:tcPr>
-            <w:tcW w:type="dxa" w:w="2880"/>
+            <w:tcW w:type="dxa" w:w="1728"/>
           </w:tcPr>
           <w:p>
             <w:pPr>
@@ -10633,15 +11677,13 @@
                 <w:rtl/>
                 <w:szCs w:val="20"/>
               </w:rPr>
-              <w:t>خلال ١–٢ أسبوع</w:t>
+              <w:t>١. الحساب التجريبي</w:t>
             </w:r>
           </w:p>
         </w:tc>
-      </w:tr>
-      <w:tr>
         <w:tc>
           <w:tcPr>
-            <w:tcW w:type="dxa" w:w="2880"/>
+            <w:tcW w:type="dxa" w:w="1728"/>
           </w:tcPr>
           <w:p>
             <w:pPr>
@@ -10656,13 +11698,13 @@
                 <w:rtl/>
                 <w:szCs w:val="20"/>
               </w:rPr>
-              <w:t>مزايا الإصدار المدفوع</w:t>
+              <w:t>البيانات الوهمية الكاملة، تجهيز تلقائي لكل منشأة جديدة، إعادة الضبط، «ابدأ ببياناتي»</w:t>
             </w:r>
           </w:p>
         </w:tc>
         <w:tc>
           <w:tcPr>
-            <w:tcW w:type="dxa" w:w="2880"/>
+            <w:tcW w:type="dxa" w:w="1728"/>
           </w:tcPr>
           <w:p>
             <w:pPr>
@@ -10677,13 +11719,13 @@
                 <w:rtl/>
                 <w:szCs w:val="20"/>
               </w:rPr>
-              <w:t>بدائل نظيفة للصلاحيات، ومجموعات بيانات الاعتماد، وسجل التدقيق، والدخول الموحد</w:t>
+              <w:t>٠</w:t>
             </w:r>
           </w:p>
         </w:tc>
         <w:tc>
           <w:tcPr>
-            <w:tcW w:type="dxa" w:w="2880"/>
+            <w:tcW w:type="dxa" w:w="1728"/>
           </w:tcPr>
           <w:p>
             <w:pPr>
@@ -10698,15 +11740,13 @@
                 <w:rtl/>
                 <w:szCs w:val="20"/>
               </w:rPr>
-              <w:t>الأسبوع اللي بعده</w:t>
+              <w:t>تسجيل جديد يصل للبرج ببيانات كاملة في أقل من دقيقتين</w:t>
             </w:r>
           </w:p>
         </w:tc>
-      </w:tr>
-      <w:tr>
         <w:tc>
           <w:tcPr>
-            <w:tcW w:type="dxa" w:w="2880"/>
+            <w:tcW w:type="dxa" w:w="1728"/>
           </w:tcPr>
           <w:p>
             <w:pPr>
@@ -10721,13 +11761,15 @@
                 <w:rtl/>
                 <w:szCs w:val="20"/>
               </w:rPr>
-              <w:t>التجربة مع العميل</w:t>
+              <w:t>2 نوفمبر</w:t>
             </w:r>
           </w:p>
         </w:tc>
+      </w:tr>
+      <w:tr>
         <w:tc>
           <w:tcPr>
-            <w:tcW w:type="dxa" w:w="2880"/>
+            <w:tcW w:type="dxa" w:w="1728"/>
           </w:tcPr>
           <w:p>
             <w:pPr>
@@ -10742,13 +11784,13 @@
                 <w:rtl/>
                 <w:szCs w:val="20"/>
               </w:rPr>
-              <w:t>ربط نظام المحاسبة (قراءة)، والموافقات من القنوات المفضلة، والملخص الصباحي، والتقرير الأسبوعي</w:t>
+              <w:t>٢. الشاشات الأساسية</w:t>
             </w:r>
           </w:p>
         </w:tc>
         <w:tc>
           <w:tcPr>
-            <w:tcW w:type="dxa" w:w="2880"/>
+            <w:tcW w:type="dxa" w:w="1728"/>
           </w:tcPr>
           <w:p>
             <w:pPr>
@@ -10763,7 +11805,926 @@
                 <w:rtl/>
                 <w:szCs w:val="20"/>
               </w:rPr>
-              <w:t>بعد مزايا الإصدار المدفوع</w:t>
+              <w:t>الإطار العام والتنقل، الإعداد حسب الدور (مع الإعداد الجماعي والروتين)، لوحة الإدارة، الرئيسية، البرج والمستودع حسب البيانات، الموافقات، الوكلاء</w:t>
+            </w:r>
+          </w:p>
+        </w:tc>
+        <w:tc>
+          <w:tcPr>
+            <w:tcW w:type="dxa" w:w="1728"/>
+          </w:tcPr>
+          <w:p>
+            <w:pPr>
+              <w:bidi w:val="1"/>
+              <w:jc w:val="right"/>
+            </w:pPr>
+            <w:r>
+              <w:rPr>
+                <w:rFonts w:ascii="Arial" w:hAnsi="Arial" w:cs="Arial"/>
+                <w:b w:val="0"/>
+                <w:sz w:val="20"/>
+                <w:rtl/>
+                <w:szCs w:val="20"/>
+              </w:rPr>
+              <w:t>٠، ١</w:t>
+            </w:r>
+          </w:p>
+        </w:tc>
+        <w:tc>
+          <w:tcPr>
+            <w:tcW w:type="dxa" w:w="1728"/>
+          </w:tcPr>
+          <w:p>
+            <w:pPr>
+              <w:bidi w:val="1"/>
+              <w:jc w:val="right"/>
+            </w:pPr>
+            <w:r>
+              <w:rPr>
+                <w:rFonts w:ascii="Arial" w:hAnsi="Arial" w:cs="Arial"/>
+                <w:b w:val="0"/>
+                <w:sz w:val="20"/>
+                <w:rtl/>
+                <w:szCs w:val="20"/>
+              </w:rPr>
+              <w:t>كل شاشة مطابقة للنموذج المعتمد وتعمل على بيانات الجداول</w:t>
+            </w:r>
+          </w:p>
+        </w:tc>
+        <w:tc>
+          <w:tcPr>
+            <w:tcW w:type="dxa" w:w="1728"/>
+          </w:tcPr>
+          <w:p>
+            <w:pPr>
+              <w:bidi w:val="1"/>
+              <w:jc w:val="right"/>
+            </w:pPr>
+            <w:r>
+              <w:rPr>
+                <w:rFonts w:ascii="Arial" w:hAnsi="Arial" w:cs="Arial"/>
+                <w:b w:val="0"/>
+                <w:sz w:val="20"/>
+                <w:rtl/>
+                <w:szCs w:val="20"/>
+              </w:rPr>
+              <w:t>4 نوفمبر</w:t>
+            </w:r>
+          </w:p>
+        </w:tc>
+      </w:tr>
+      <w:tr>
+        <w:tc>
+          <w:tcPr>
+            <w:tcW w:type="dxa" w:w="1728"/>
+          </w:tcPr>
+          <w:p>
+            <w:pPr>
+              <w:bidi w:val="1"/>
+              <w:jc w:val="right"/>
+            </w:pPr>
+            <w:r>
+              <w:rPr>
+                <w:rFonts w:ascii="Arial" w:hAnsi="Arial" w:cs="Arial"/>
+                <w:b w:val="0"/>
+                <w:sz w:val="20"/>
+                <w:rtl/>
+                <w:szCs w:val="20"/>
+              </w:rPr>
+              <w:t>٣. الذكاء والأتمتة</w:t>
+            </w:r>
+          </w:p>
+        </w:tc>
+        <w:tc>
+          <w:tcPr>
+            <w:tcW w:type="dxa" w:w="1728"/>
+          </w:tcPr>
+          <w:p>
+            <w:pPr>
+              <w:bidi w:val="1"/>
+              <w:jc w:val="right"/>
+            </w:pPr>
+            <w:r>
+              <w:rPr>
+                <w:rFonts w:ascii="Arial" w:hAnsi="Arial" w:cs="Arial"/>
+                <w:b w:val="0"/>
+                <w:sz w:val="20"/>
+                <w:rtl/>
+                <w:szCs w:val="20"/>
+              </w:rPr>
+              <w:t>ربط المحادثة باللوحة، بناء سير العمل حيًا في اللوحة، المتابعات المؤتمتة، صندوق الإيميل والمسودات، متابعة الإيميلات، مهام الفريق، ذاكرة المنشأة</w:t>
+            </w:r>
+          </w:p>
+        </w:tc>
+        <w:tc>
+          <w:tcPr>
+            <w:tcW w:type="dxa" w:w="1728"/>
+          </w:tcPr>
+          <w:p>
+            <w:pPr>
+              <w:bidi w:val="1"/>
+              <w:jc w:val="right"/>
+            </w:pPr>
+            <w:r>
+              <w:rPr>
+                <w:rFonts w:ascii="Arial" w:hAnsi="Arial" w:cs="Arial"/>
+                <w:b w:val="0"/>
+                <w:sz w:val="20"/>
+                <w:rtl/>
+                <w:szCs w:val="20"/>
+              </w:rPr>
+              <w:t>٢</w:t>
+            </w:r>
+          </w:p>
+        </w:tc>
+        <w:tc>
+          <w:tcPr>
+            <w:tcW w:type="dxa" w:w="1728"/>
+          </w:tcPr>
+          <w:p>
+            <w:pPr>
+              <w:bidi w:val="1"/>
+              <w:jc w:val="right"/>
+            </w:pPr>
+            <w:r>
+              <w:rPr>
+                <w:rFonts w:ascii="Arial" w:hAnsi="Arial" w:cs="Arial"/>
+                <w:b w:val="0"/>
+                <w:sz w:val="20"/>
+                <w:rtl/>
+                <w:szCs w:val="20"/>
+              </w:rPr>
+              <w:t>سيناريو العرض كاملًا يعمل بالمساعد الحقيقي</w:t>
+            </w:r>
+          </w:p>
+        </w:tc>
+        <w:tc>
+          <w:tcPr>
+            <w:tcW w:type="dxa" w:w="1728"/>
+          </w:tcPr>
+          <w:p>
+            <w:pPr>
+              <w:bidi w:val="1"/>
+              <w:jc w:val="right"/>
+            </w:pPr>
+            <w:r>
+              <w:rPr>
+                <w:rFonts w:ascii="Arial" w:hAnsi="Arial" w:cs="Arial"/>
+                <w:b w:val="0"/>
+                <w:sz w:val="20"/>
+                <w:rtl/>
+                <w:szCs w:val="20"/>
+              </w:rPr>
+              <w:t>5 نوفمبر</w:t>
+            </w:r>
+          </w:p>
+        </w:tc>
+      </w:tr>
+      <w:tr>
+        <w:tc>
+          <w:tcPr>
+            <w:tcW w:type="dxa" w:w="1728"/>
+          </w:tcPr>
+          <w:p>
+            <w:pPr>
+              <w:bidi w:val="1"/>
+              <w:jc w:val="right"/>
+            </w:pPr>
+            <w:r>
+              <w:rPr>
+                <w:rFonts w:ascii="Arial" w:hAnsi="Arial" w:cs="Arial"/>
+                <w:b w:val="0"/>
+                <w:sz w:val="20"/>
+                <w:rtl/>
+                <w:szCs w:val="20"/>
+              </w:rPr>
+              <w:t>٤. التكاملات والإدارة</w:t>
+            </w:r>
+          </w:p>
+        </w:tc>
+        <w:tc>
+          <w:tcPr>
+            <w:tcW w:type="dxa" w:w="1728"/>
+          </w:tcPr>
+          <w:p>
+            <w:pPr>
+              <w:bidi w:val="1"/>
+              <w:jc w:val="right"/>
+            </w:pPr>
+            <w:r>
+              <w:rPr>
+                <w:rFonts w:ascii="Arial" w:hAnsi="Arial" w:cs="Arial"/>
+                <w:b w:val="0"/>
+                <w:sz w:val="20"/>
+                <w:rtl/>
+                <w:szCs w:val="20"/>
+              </w:rPr>
+              <w:t>مركز التكاملات (مدمج وعن طريق API)، الإدارة والصلاحيات وسجل التدقيق، التقارير PDF وExcel والإيميل</w:t>
+            </w:r>
+          </w:p>
+        </w:tc>
+        <w:tc>
+          <w:tcPr>
+            <w:tcW w:type="dxa" w:w="1728"/>
+          </w:tcPr>
+          <w:p>
+            <w:pPr>
+              <w:bidi w:val="1"/>
+              <w:jc w:val="right"/>
+            </w:pPr>
+            <w:r>
+              <w:rPr>
+                <w:rFonts w:ascii="Arial" w:hAnsi="Arial" w:cs="Arial"/>
+                <w:b w:val="0"/>
+                <w:sz w:val="20"/>
+                <w:rtl/>
+                <w:szCs w:val="20"/>
+              </w:rPr>
+              <w:t>٢</w:t>
+            </w:r>
+          </w:p>
+        </w:tc>
+        <w:tc>
+          <w:tcPr>
+            <w:tcW w:type="dxa" w:w="1728"/>
+          </w:tcPr>
+          <w:p>
+            <w:pPr>
+              <w:bidi w:val="1"/>
+              <w:jc w:val="right"/>
+            </w:pPr>
+            <w:r>
+              <w:rPr>
+                <w:rFonts w:ascii="Arial" w:hAnsi="Arial" w:cs="Arial"/>
+                <w:b w:val="0"/>
+                <w:sz w:val="20"/>
+                <w:rtl/>
+                <w:szCs w:val="20"/>
+              </w:rPr>
+              <w:t>ربط تكامل حقيقي من الواجهة، وكل إجراء في سجل التدقيق</w:t>
+            </w:r>
+          </w:p>
+        </w:tc>
+        <w:tc>
+          <w:tcPr>
+            <w:tcW w:type="dxa" w:w="1728"/>
+          </w:tcPr>
+          <w:p>
+            <w:pPr>
+              <w:bidi w:val="1"/>
+              <w:jc w:val="right"/>
+            </w:pPr>
+            <w:r>
+              <w:rPr>
+                <w:rFonts w:ascii="Arial" w:hAnsi="Arial" w:cs="Arial"/>
+                <w:b w:val="0"/>
+                <w:sz w:val="20"/>
+                <w:rtl/>
+                <w:szCs w:val="20"/>
+              </w:rPr>
+              <w:t>5 نوفمبر</w:t>
+            </w:r>
+          </w:p>
+        </w:tc>
+      </w:tr>
+      <w:tr>
+        <w:tc>
+          <w:tcPr>
+            <w:tcW w:type="dxa" w:w="1728"/>
+          </w:tcPr>
+          <w:p>
+            <w:pPr>
+              <w:bidi w:val="1"/>
+              <w:jc w:val="right"/>
+            </w:pPr>
+            <w:r>
+              <w:rPr>
+                <w:rFonts w:ascii="Arial" w:hAnsi="Arial" w:cs="Arial"/>
+                <w:b w:val="0"/>
+                <w:sz w:val="20"/>
+                <w:rtl/>
+                <w:szCs w:val="20"/>
+              </w:rPr>
+              <w:t>٥. الاستقرار</w:t>
+            </w:r>
+          </w:p>
+        </w:tc>
+        <w:tc>
+          <w:tcPr>
+            <w:tcW w:type="dxa" w:w="1728"/>
+          </w:tcPr>
+          <w:p>
+            <w:pPr>
+              <w:bidi w:val="1"/>
+              <w:jc w:val="right"/>
+            </w:pPr>
+            <w:r>
+              <w:rPr>
+                <w:rFonts w:ascii="Arial" w:hAnsi="Arial" w:cs="Arial"/>
+                <w:b w:val="0"/>
+                <w:sz w:val="20"/>
+                <w:rtl/>
+                <w:szCs w:val="20"/>
+              </w:rPr>
+              <w:t>بيئة اختبار، اختبار آلي للرحلة، نشر مرقّم ورجوع، مراقبة وتنبيه، نسخ احتياطي ثانٍ، حدود الاستخدام، فصل التشغيل عن الواجهة</w:t>
+            </w:r>
+          </w:p>
+        </w:tc>
+        <w:tc>
+          <w:tcPr>
+            <w:tcW w:type="dxa" w:w="1728"/>
+          </w:tcPr>
+          <w:p>
+            <w:pPr>
+              <w:bidi w:val="1"/>
+              <w:jc w:val="right"/>
+            </w:pPr>
+            <w:r>
+              <w:rPr>
+                <w:rFonts w:ascii="Arial" w:hAnsi="Arial" w:cs="Arial"/>
+                <w:b w:val="0"/>
+                <w:sz w:val="20"/>
+                <w:rtl/>
+                <w:szCs w:val="20"/>
+              </w:rPr>
+              <w:t>يعمل بالتوازي</w:t>
+            </w:r>
+          </w:p>
+        </w:tc>
+        <w:tc>
+          <w:tcPr>
+            <w:tcW w:type="dxa" w:w="1728"/>
+          </w:tcPr>
+          <w:p>
+            <w:pPr>
+              <w:bidi w:val="1"/>
+              <w:jc w:val="right"/>
+            </w:pPr>
+            <w:r>
+              <w:rPr>
+                <w:rFonts w:ascii="Arial" w:hAnsi="Arial" w:cs="Arial"/>
+                <w:b w:val="0"/>
+                <w:sz w:val="20"/>
+                <w:rtl/>
+                <w:szCs w:val="20"/>
+              </w:rPr>
+              <w:t>اختبار تحمّل ناجح بالأرقام المستهدفة</w:t>
+            </w:r>
+          </w:p>
+        </w:tc>
+        <w:tc>
+          <w:tcPr>
+            <w:tcW w:type="dxa" w:w="1728"/>
+          </w:tcPr>
+          <w:p>
+            <w:pPr>
+              <w:bidi w:val="1"/>
+              <w:jc w:val="right"/>
+            </w:pPr>
+            <w:r>
+              <w:rPr>
+                <w:rFonts w:ascii="Arial" w:hAnsi="Arial" w:cs="Arial"/>
+                <w:b w:val="0"/>
+                <w:sz w:val="20"/>
+                <w:rtl/>
+                <w:szCs w:val="20"/>
+              </w:rPr>
+              <w:t>8 نوفمبر</w:t>
+            </w:r>
+          </w:p>
+        </w:tc>
+      </w:tr>
+      <w:tr>
+        <w:tc>
+          <w:tcPr>
+            <w:tcW w:type="dxa" w:w="1728"/>
+          </w:tcPr>
+          <w:p>
+            <w:pPr>
+              <w:bidi w:val="1"/>
+              <w:jc w:val="right"/>
+            </w:pPr>
+            <w:r>
+              <w:rPr>
+                <w:rFonts w:ascii="Arial" w:hAnsi="Arial" w:cs="Arial"/>
+                <w:b w:val="0"/>
+                <w:sz w:val="20"/>
+                <w:rtl/>
+                <w:szCs w:val="20"/>
+              </w:rPr>
+              <w:t>٦. الاشتراك</w:t>
+            </w:r>
+          </w:p>
+        </w:tc>
+        <w:tc>
+          <w:tcPr>
+            <w:tcW w:type="dxa" w:w="1728"/>
+          </w:tcPr>
+          <w:p>
+            <w:pPr>
+              <w:bidi w:val="1"/>
+              <w:jc w:val="right"/>
+            </w:pPr>
+            <w:r>
+              <w:rPr>
+                <w:rFonts w:ascii="Arial" w:hAnsi="Arial" w:cs="Arial"/>
+                <w:b w:val="0"/>
+                <w:sz w:val="20"/>
+                <w:rtl/>
+                <w:szCs w:val="20"/>
+              </w:rPr>
+              <w:t>التسجيل الذاتي، التجربة 14 يومًا، الباقات والحدود، الإيميلات، صفحة الأسعار، لوحة الإدارة الداخلية، الشروط والخصوصية</w:t>
+            </w:r>
+          </w:p>
+        </w:tc>
+        <w:tc>
+          <w:tcPr>
+            <w:tcW w:type="dxa" w:w="1728"/>
+          </w:tcPr>
+          <w:p>
+            <w:pPr>
+              <w:bidi w:val="1"/>
+              <w:jc w:val="right"/>
+            </w:pPr>
+            <w:r>
+              <w:rPr>
+                <w:rFonts w:ascii="Arial" w:hAnsi="Arial" w:cs="Arial"/>
+                <w:b w:val="0"/>
+                <w:sz w:val="20"/>
+                <w:rtl/>
+                <w:szCs w:val="20"/>
+              </w:rPr>
+              <w:t>١</w:t>
+            </w:r>
+          </w:p>
+        </w:tc>
+        <w:tc>
+          <w:tcPr>
+            <w:tcW w:type="dxa" w:w="1728"/>
+          </w:tcPr>
+          <w:p>
+            <w:pPr>
+              <w:bidi w:val="1"/>
+              <w:jc w:val="right"/>
+            </w:pPr>
+            <w:r>
+              <w:rPr>
+                <w:rFonts w:ascii="Arial" w:hAnsi="Arial" w:cs="Arial"/>
+                <w:b w:val="0"/>
+                <w:sz w:val="20"/>
+                <w:rtl/>
+                <w:szCs w:val="20"/>
+              </w:rPr>
+              <w:t>منشأة تسجّل وتجرّب وتنتهي تجربتها بشكل صحيح</w:t>
+            </w:r>
+          </w:p>
+        </w:tc>
+        <w:tc>
+          <w:tcPr>
+            <w:tcW w:type="dxa" w:w="1728"/>
+          </w:tcPr>
+          <w:p>
+            <w:pPr>
+              <w:bidi w:val="1"/>
+              <w:jc w:val="right"/>
+            </w:pPr>
+            <w:r>
+              <w:rPr>
+                <w:rFonts w:ascii="Arial" w:hAnsi="Arial" w:cs="Arial"/>
+                <w:b w:val="0"/>
+                <w:sz w:val="20"/>
+                <w:rtl/>
+                <w:szCs w:val="20"/>
+              </w:rPr>
+              <w:t>8 نوفمبر</w:t>
+            </w:r>
+          </w:p>
+        </w:tc>
+      </w:tr>
+      <w:tr>
+        <w:tc>
+          <w:tcPr>
+            <w:tcW w:type="dxa" w:w="1728"/>
+          </w:tcPr>
+          <w:p>
+            <w:pPr>
+              <w:bidi w:val="1"/>
+              <w:jc w:val="right"/>
+            </w:pPr>
+            <w:r>
+              <w:rPr>
+                <w:rFonts w:ascii="Arial" w:hAnsi="Arial" w:cs="Arial"/>
+                <w:b w:val="0"/>
+                <w:sz w:val="20"/>
+                <w:rtl/>
+                <w:szCs w:val="20"/>
+              </w:rPr>
+              <w:t>٧. بدائل المزايا المدفوعة</w:t>
+            </w:r>
+          </w:p>
+        </w:tc>
+        <w:tc>
+          <w:tcPr>
+            <w:tcW w:type="dxa" w:w="1728"/>
+          </w:tcPr>
+          <w:p>
+            <w:pPr>
+              <w:bidi w:val="1"/>
+              <w:jc w:val="right"/>
+            </w:pPr>
+            <w:r>
+              <w:rPr>
+                <w:rFonts w:ascii="Arial" w:hAnsi="Arial" w:cs="Arial"/>
+                <w:b w:val="0"/>
+                <w:sz w:val="20"/>
+                <w:rtl/>
+                <w:szCs w:val="20"/>
+              </w:rPr>
+              <w:t>طبقة التوافق ومسار التشغيل، الصلاحيات، سجل التدقيق، مجموعات بيانات الاعتماد، الدخول الموحد وسياسات الجلسات، العلامة البيضاء والاحتفاظ بالبيانات؛ ثم حذف كود الإصدار المدفوع</w:t>
+            </w:r>
+          </w:p>
+        </w:tc>
+        <w:tc>
+          <w:tcPr>
+            <w:tcW w:type="dxa" w:w="1728"/>
+          </w:tcPr>
+          <w:p>
+            <w:pPr>
+              <w:bidi w:val="1"/>
+              <w:jc w:val="right"/>
+            </w:pPr>
+            <w:r>
+              <w:rPr>
+                <w:rFonts w:ascii="Arial" w:hAnsi="Arial" w:cs="Arial"/>
+                <w:b w:val="0"/>
+                <w:sz w:val="20"/>
+                <w:rtl/>
+                <w:szCs w:val="20"/>
+              </w:rPr>
+              <w:t>المواصفات تُكتب من الآن</w:t>
+            </w:r>
+          </w:p>
+        </w:tc>
+        <w:tc>
+          <w:tcPr>
+            <w:tcW w:type="dxa" w:w="1728"/>
+          </w:tcPr>
+          <w:p>
+            <w:pPr>
+              <w:bidi w:val="1"/>
+              <w:jc w:val="right"/>
+            </w:pPr>
+            <w:r>
+              <w:rPr>
+                <w:rFonts w:ascii="Arial" w:hAnsi="Arial" w:cs="Arial"/>
+                <w:b w:val="0"/>
+                <w:sz w:val="20"/>
+                <w:rtl/>
+                <w:szCs w:val="20"/>
+              </w:rPr>
+              <w:t>كل اختبارات النظام ناجحة بدون مجلد الإصدار المدفوع، والمقارنة مع الأصلي بلا فروق</w:t>
+            </w:r>
+          </w:p>
+        </w:tc>
+        <w:tc>
+          <w:tcPr>
+            <w:tcW w:type="dxa" w:w="1728"/>
+          </w:tcPr>
+          <w:p>
+            <w:pPr>
+              <w:bidi w:val="1"/>
+              <w:jc w:val="right"/>
+            </w:pPr>
+            <w:r>
+              <w:rPr>
+                <w:rFonts w:ascii="Arial" w:hAnsi="Arial" w:cs="Arial"/>
+                <w:b w:val="0"/>
+                <w:sz w:val="20"/>
+                <w:rtl/>
+                <w:szCs w:val="20"/>
+              </w:rPr>
+              <w:t>14 نوفمبر</w:t>
+            </w:r>
+          </w:p>
+        </w:tc>
+      </w:tr>
+      <w:tr>
+        <w:tc>
+          <w:tcPr>
+            <w:tcW w:type="dxa" w:w="1728"/>
+          </w:tcPr>
+          <w:p>
+            <w:pPr>
+              <w:bidi w:val="1"/>
+              <w:jc w:val="right"/>
+            </w:pPr>
+            <w:r>
+              <w:rPr>
+                <w:rFonts w:ascii="Arial" w:hAnsi="Arial" w:cs="Arial"/>
+                <w:b w:val="0"/>
+                <w:sz w:val="20"/>
+                <w:rtl/>
+                <w:szCs w:val="20"/>
+              </w:rPr>
+              <w:t>٨. الإطلاق</w:t>
+            </w:r>
+          </w:p>
+        </w:tc>
+        <w:tc>
+          <w:tcPr>
+            <w:tcW w:type="dxa" w:w="1728"/>
+          </w:tcPr>
+          <w:p>
+            <w:pPr>
+              <w:bidi w:val="1"/>
+              <w:jc w:val="right"/>
+            </w:pPr>
+            <w:r>
+              <w:rPr>
+                <w:rFonts w:ascii="Arial" w:hAnsi="Arial" w:cs="Arial"/>
+                <w:b w:val="0"/>
+                <w:sz w:val="20"/>
+                <w:rtl/>
+                <w:szCs w:val="20"/>
+              </w:rPr>
+              <w:t>تجربة داخلية مع 3–5 منشآت مقربة، إصلاحات، تجميد الإصدار 13 نوفمبر</w:t>
+            </w:r>
+          </w:p>
+        </w:tc>
+        <w:tc>
+          <w:tcPr>
+            <w:tcW w:type="dxa" w:w="1728"/>
+          </w:tcPr>
+          <w:p>
+            <w:pPr>
+              <w:bidi w:val="1"/>
+              <w:jc w:val="right"/>
+            </w:pPr>
+            <w:r>
+              <w:rPr>
+                <w:rFonts w:ascii="Arial" w:hAnsi="Arial" w:cs="Arial"/>
+                <w:b w:val="0"/>
+                <w:sz w:val="20"/>
+                <w:rtl/>
+                <w:szCs w:val="20"/>
+              </w:rPr>
+              <w:t>كل ما سبق</w:t>
+            </w:r>
+          </w:p>
+        </w:tc>
+        <w:tc>
+          <w:tcPr>
+            <w:tcW w:type="dxa" w:w="1728"/>
+          </w:tcPr>
+          <w:p>
+            <w:pPr>
+              <w:bidi w:val="1"/>
+              <w:jc w:val="right"/>
+            </w:pPr>
+            <w:r>
+              <w:rPr>
+                <w:rFonts w:ascii="Arial" w:hAnsi="Arial" w:cs="Arial"/>
+                <w:b w:val="0"/>
+                <w:sz w:val="20"/>
+                <w:rtl/>
+                <w:szCs w:val="20"/>
+              </w:rPr>
+              <w:t>قائمة جاهزية الإطلاق مكتملة</w:t>
+            </w:r>
+          </w:p>
+        </w:tc>
+        <w:tc>
+          <w:tcPr>
+            <w:tcW w:type="dxa" w:w="1728"/>
+          </w:tcPr>
+          <w:p>
+            <w:pPr>
+              <w:bidi w:val="1"/>
+              <w:jc w:val="right"/>
+            </w:pPr>
+            <w:r>
+              <w:rPr>
+                <w:rFonts w:ascii="Arial" w:hAnsi="Arial" w:cs="Arial"/>
+                <w:b w:val="0"/>
+                <w:sz w:val="20"/>
+                <w:rtl/>
+                <w:szCs w:val="20"/>
+              </w:rPr>
+              <w:t>15 نوفمبر</w:t>
+            </w:r>
+          </w:p>
+        </w:tc>
+      </w:tr>
+      <w:tr>
+        <w:tc>
+          <w:tcPr>
+            <w:tcW w:type="dxa" w:w="1728"/>
+          </w:tcPr>
+          <w:p>
+            <w:pPr>
+              <w:bidi w:val="1"/>
+              <w:jc w:val="right"/>
+            </w:pPr>
+            <w:r>
+              <w:rPr>
+                <w:rFonts w:ascii="Arial" w:hAnsi="Arial" w:cs="Arial"/>
+                <w:b w:val="0"/>
+                <w:sz w:val="20"/>
+                <w:rtl/>
+                <w:szCs w:val="20"/>
+              </w:rPr>
+              <w:t>٩. الدفع والفوترة</w:t>
+            </w:r>
+          </w:p>
+        </w:tc>
+        <w:tc>
+          <w:tcPr>
+            <w:tcW w:type="dxa" w:w="1728"/>
+          </w:tcPr>
+          <w:p>
+            <w:pPr>
+              <w:bidi w:val="1"/>
+              <w:jc w:val="right"/>
+            </w:pPr>
+            <w:r>
+              <w:rPr>
+                <w:rFonts w:ascii="Arial" w:hAnsi="Arial" w:cs="Arial"/>
+                <w:b w:val="0"/>
+                <w:sz w:val="20"/>
+                <w:rtl/>
+                <w:szCs w:val="20"/>
+              </w:rPr>
+              <w:t>بوابة الدفع، الفواتير الإلكترونية، التحويل من تجربة لمدفوع</w:t>
+            </w:r>
+          </w:p>
+        </w:tc>
+        <w:tc>
+          <w:tcPr>
+            <w:tcW w:type="dxa" w:w="1728"/>
+          </w:tcPr>
+          <w:p>
+            <w:pPr>
+              <w:bidi w:val="1"/>
+              <w:jc w:val="right"/>
+            </w:pPr>
+            <w:r>
+              <w:rPr>
+                <w:rFonts w:ascii="Arial" w:hAnsi="Arial" w:cs="Arial"/>
+                <w:b w:val="0"/>
+                <w:sz w:val="20"/>
+                <w:rtl/>
+                <w:szCs w:val="20"/>
+              </w:rPr>
+              <w:t>حساب التاجر</w:t>
+            </w:r>
+          </w:p>
+        </w:tc>
+        <w:tc>
+          <w:tcPr>
+            <w:tcW w:type="dxa" w:w="1728"/>
+          </w:tcPr>
+          <w:p>
+            <w:pPr>
+              <w:bidi w:val="1"/>
+              <w:jc w:val="right"/>
+            </w:pPr>
+            <w:r>
+              <w:rPr>
+                <w:rFonts w:ascii="Arial" w:hAnsi="Arial" w:cs="Arial"/>
+                <w:b w:val="0"/>
+                <w:sz w:val="20"/>
+                <w:rtl/>
+                <w:szCs w:val="20"/>
+              </w:rPr>
+              <w:t>أول عملية دفع حقيقية ناجحة</w:t>
+            </w:r>
+          </w:p>
+        </w:tc>
+        <w:tc>
+          <w:tcPr>
+            <w:tcW w:type="dxa" w:w="1728"/>
+          </w:tcPr>
+          <w:p>
+            <w:pPr>
+              <w:bidi w:val="1"/>
+              <w:jc w:val="right"/>
+            </w:pPr>
+            <w:r>
+              <w:rPr>
+                <w:rFonts w:ascii="Arial" w:hAnsi="Arial" w:cs="Arial"/>
+                <w:b w:val="0"/>
+                <w:sz w:val="20"/>
+                <w:rtl/>
+                <w:szCs w:val="20"/>
+              </w:rPr>
+              <w:t>25 نوفمبر</w:t>
+            </w:r>
+          </w:p>
+        </w:tc>
+      </w:tr>
+      <w:tr>
+        <w:tc>
+          <w:tcPr>
+            <w:tcW w:type="dxa" w:w="1728"/>
+          </w:tcPr>
+          <w:p>
+            <w:pPr>
+              <w:bidi w:val="1"/>
+              <w:jc w:val="right"/>
+            </w:pPr>
+            <w:r>
+              <w:rPr>
+                <w:rFonts w:ascii="Arial" w:hAnsi="Arial" w:cs="Arial"/>
+                <w:b w:val="0"/>
+                <w:sz w:val="20"/>
+                <w:rtl/>
+                <w:szCs w:val="20"/>
+              </w:rPr>
+              <w:t>لاحقًا</w:t>
+            </w:r>
+          </w:p>
+        </w:tc>
+        <w:tc>
+          <w:tcPr>
+            <w:tcW w:type="dxa" w:w="1728"/>
+          </w:tcPr>
+          <w:p>
+            <w:pPr>
+              <w:bidi w:val="1"/>
+              <w:jc w:val="right"/>
+            </w:pPr>
+            <w:r>
+              <w:rPr>
+                <w:rFonts w:ascii="Arial" w:hAnsi="Arial" w:cs="Arial"/>
+                <w:b w:val="0"/>
+                <w:sz w:val="20"/>
+                <w:rtl/>
+                <w:szCs w:val="20"/>
+              </w:rPr>
+              <w:t>موصلات ERP عن طريق API حسب الطلب، الموافقات من واتساب، SCIM ونسخ مساحات العمل، العربية</w:t>
+            </w:r>
+          </w:p>
+        </w:tc>
+        <w:tc>
+          <w:tcPr>
+            <w:tcW w:type="dxa" w:w="1728"/>
+          </w:tcPr>
+          <w:p>
+            <w:pPr>
+              <w:bidi w:val="1"/>
+              <w:jc w:val="right"/>
+            </w:pPr>
+            <w:r>
+              <w:rPr>
+                <w:rFonts w:ascii="Arial" w:hAnsi="Arial" w:cs="Arial"/>
+                <w:b w:val="0"/>
+                <w:sz w:val="20"/>
+                <w:rtl/>
+                <w:szCs w:val="20"/>
+              </w:rPr>
+              <w:t>—</w:t>
+            </w:r>
+          </w:p>
+        </w:tc>
+        <w:tc>
+          <w:tcPr>
+            <w:tcW w:type="dxa" w:w="1728"/>
+          </w:tcPr>
+          <w:p>
+            <w:pPr>
+              <w:bidi w:val="1"/>
+              <w:jc w:val="right"/>
+            </w:pPr>
+            <w:r>
+              <w:rPr>
+                <w:rFonts w:ascii="Arial" w:hAnsi="Arial" w:cs="Arial"/>
+                <w:b w:val="0"/>
+                <w:sz w:val="20"/>
+                <w:rtl/>
+                <w:szCs w:val="20"/>
+              </w:rPr>
+              <w:t>—</w:t>
+            </w:r>
+          </w:p>
+        </w:tc>
+        <w:tc>
+          <w:tcPr>
+            <w:tcW w:type="dxa" w:w="1728"/>
+          </w:tcPr>
+          <w:p>
+            <w:pPr>
+              <w:bidi w:val="1"/>
+              <w:jc w:val="right"/>
+            </w:pPr>
+            <w:r>
+              <w:rPr>
+                <w:rFonts w:ascii="Arial" w:hAnsi="Arial" w:cs="Arial"/>
+                <w:b w:val="0"/>
+                <w:sz w:val="20"/>
+                <w:rtl/>
+                <w:szCs w:val="20"/>
+              </w:rPr>
+              <w:t>بعد الإطلاق</w:t>
             </w:r>
           </w:p>
         </w:tc>
@@ -10779,18 +12740,26 @@
         <w:rPr>
           <w:rFonts w:ascii="Arial" w:hAnsi="Arial" w:cs="Arial"/>
           <w:b/>
-          <w:color w:val="006A5B"/>
-          <w:sz w:val="30"/>
-          <w:rtl/>
-          <w:szCs w:val="30"/>
+          <w:sz w:val="22"/>
+          <w:rtl/>
+          <w:szCs w:val="22"/>
           <w:bCs/>
         </w:rPr>
-        <w:t>١٤. المخاطر والأسئلة المفتوحة</w:t>
+        <w:t>طريقة العمل في كل مرحلة:</w:t>
+      </w:r>
+      <w:r>
+        <w:rPr>
+          <w:rFonts w:ascii="Arial" w:hAnsi="Arial" w:cs="Arial"/>
+          <w:b w:val="0"/>
+          <w:sz w:val="22"/>
+          <w:rtl/>
+          <w:szCs w:val="22"/>
+        </w:rPr>
+        <w:t xml:space="preserve"> خطة مكتوبة في الريبو، Codex يكتب الكود باختبارات أولًا، مراجعة مستقلة لكل مهمة، فحص الأنواع والبناء الكامل على سيرفر البناء، ثم الدمج. لا يُبنى شيء خارج هذه الوثيقة دون موافقة.</w:t>
       </w:r>
     </w:p>
     <w:p>
       <w:pPr>
-        <w:pStyle w:val="ListBullet"/>
         <w:bidi w:val="1"/>
         <w:jc w:val="right"/>
       </w:pPr>
@@ -10803,7 +12772,7 @@
           <w:szCs w:val="22"/>
           <w:bCs/>
         </w:rPr>
-        <w:t>نظام العميل:</w:t>
+        <w:t>مطلوب من صالح:</w:t>
       </w:r>
       <w:r>
         <w:rPr>
@@ -10813,147 +12782,7 @@
           <w:rtl/>
           <w:szCs w:val="22"/>
         </w:rPr>
-        <w:t xml:space="preserve"> أي نظام محاسبة يستخدم، وأي إصدار، ووين استضافته، وكم سنة من البيانات التاريخية عنده.</w:t>
-      </w:r>
-    </w:p>
-    <w:p>
-      <w:pPr>
-        <w:pStyle w:val="ListBullet"/>
-        <w:bidi w:val="1"/>
-        <w:jc w:val="right"/>
-      </w:pPr>
-      <w:r>
-        <w:rPr>
-          <w:rFonts w:ascii="Arial" w:hAnsi="Arial" w:cs="Arial"/>
-          <w:b/>
-          <w:sz w:val="22"/>
-          <w:rtl/>
-          <w:szCs w:val="22"/>
-          <w:bCs/>
-        </w:rPr>
-        <w:t>الاعتمادات:</w:t>
-      </w:r>
-      <w:r>
-        <w:rPr>
-          <w:rFonts w:ascii="Arial" w:hAnsi="Arial" w:cs="Arial"/>
-          <w:b w:val="0"/>
-          <w:sz w:val="22"/>
-          <w:rtl/>
-          <w:szCs w:val="22"/>
-        </w:rPr>
-        <w:t xml:space="preserve"> مين يعتمد وش، وكم حد كل دور بالريال.</w:t>
-      </w:r>
-    </w:p>
-    <w:p>
-      <w:pPr>
-        <w:pStyle w:val="ListBullet"/>
-        <w:bidi w:val="1"/>
-        <w:jc w:val="right"/>
-      </w:pPr>
-      <w:r>
-        <w:rPr>
-          <w:rFonts w:ascii="Arial" w:hAnsi="Arial" w:cs="Arial"/>
-          <w:b/>
-          <w:sz w:val="22"/>
-          <w:rtl/>
-          <w:szCs w:val="22"/>
-          <w:bCs/>
-        </w:rPr>
-        <w:t>القنوات:</w:t>
-      </w:r>
-      <w:r>
-        <w:rPr>
-          <w:rFonts w:ascii="Arial" w:hAnsi="Arial" w:cs="Arial"/>
-          <w:b w:val="0"/>
-          <w:sz w:val="22"/>
-          <w:rtl/>
-          <w:szCs w:val="22"/>
-        </w:rPr>
-        <w:t xml:space="preserve"> أي قنوات تعتمدها المنشأة (إيميل، Teams، واتساب)؛ وإن اختارت واتساب: رقم واتساب للأعمال ومدة توثيقه عند Meta.</w:t>
-      </w:r>
-    </w:p>
-    <w:p>
-      <w:pPr>
-        <w:pStyle w:val="ListBullet"/>
-        <w:bidi w:val="1"/>
-        <w:jc w:val="right"/>
-      </w:pPr>
-      <w:r>
-        <w:rPr>
-          <w:rFonts w:ascii="Arial" w:hAnsi="Arial" w:cs="Arial"/>
-          <w:b/>
-          <w:sz w:val="22"/>
-          <w:rtl/>
-          <w:szCs w:val="22"/>
-          <w:bCs/>
-        </w:rPr>
-        <w:t>الكتابة في النظام:</w:t>
-      </w:r>
-      <w:r>
-        <w:rPr>
-          <w:rFonts w:ascii="Arial" w:hAnsi="Arial" w:cs="Arial"/>
-          <w:b w:val="0"/>
-          <w:sz w:val="22"/>
-          <w:rtl/>
-          <w:szCs w:val="22"/>
-        </w:rPr>
-        <w:t xml:space="preserve"> هل الإدارة تبي الوكلاء يكتبون في نظام المحاسبة من الأسبوع الثاني، أو يبقون قراءة فقط لفترة أطول.</w:t>
-      </w:r>
-    </w:p>
-    <w:p>
-      <w:pPr>
-        <w:pStyle w:val="ListBullet"/>
-        <w:bidi w:val="1"/>
-        <w:jc w:val="right"/>
-      </w:pPr>
-      <w:r>
-        <w:rPr>
-          <w:rFonts w:ascii="Arial" w:hAnsi="Arial" w:cs="Arial"/>
-          <w:b/>
-          <w:sz w:val="22"/>
-          <w:rtl/>
-          <w:szCs w:val="22"/>
-          <w:bCs/>
-        </w:rPr>
-        <w:t>جودة البيانات:</w:t>
-      </w:r>
-      <w:r>
-        <w:rPr>
-          <w:rFonts w:ascii="Arial" w:hAnsi="Arial" w:cs="Arial"/>
-          <w:b w:val="0"/>
-          <w:sz w:val="22"/>
-          <w:rtl/>
-          <w:szCs w:val="22"/>
-        </w:rPr>
-        <w:t xml:space="preserve"> إذا كانت البيانات في نظام المحاسبة ضعيفة، تقل دقة التوقعات. فلازم وكيل التخطيط يرفض التوقع إذا كان التاريخ قصير.</w:t>
-      </w:r>
-    </w:p>
-    <w:p>
-      <w:pPr>
-        <w:pStyle w:val="ListBullet"/>
-        <w:bidi w:val="1"/>
-        <w:jc w:val="right"/>
-      </w:pPr>
-      <w:r>
-        <w:rPr>
-          <w:rFonts w:ascii="Arial" w:hAnsi="Arial" w:cs="Arial"/>
-          <w:b/>
-          <w:sz w:val="22"/>
-          <w:rtl/>
-          <w:szCs w:val="22"/>
-          <w:bCs/>
-        </w:rPr>
-        <w:t>الرخصة:</w:t>
-      </w:r>
-      <w:r>
-        <w:rPr>
-          <w:rFonts w:ascii="Arial" w:hAnsi="Arial" w:cs="Arial"/>
-          <w:b w:val="0"/>
-          <w:sz w:val="22"/>
-          <w:rtl/>
-          <w:szCs w:val="22"/>
-        </w:rPr>
-        <w:t xml:space="preserve"> لازم نحسم طريق مزايا الإصدار المدفوع (اشتراك أو بدائل نظيفة) قبل التشغيل الفعلي.</w:t>
+        <w:t xml:space="preserve"> اعتماد هذه الوثيقة؛ حساب تاجر في بوابة الدفع (Moyasar مقترح)؛ مزود رسائل التحقق؛ مزود الفاتورة الإلكترونية إذا لم توفره البوابة؛ سيرفرا الإنتاج 32 جيجا.</w:t>
       </w:r>
     </w:p>
     <w:p>

</xml_diff>